<commit_message>
Fix CV committee-line indent; document CV maintenance workflow
- Align the 'Program Evaluation Committee, MFM Fellowship' line with its
  siblings (add missing 1in left_indent) and remove a stray double space.
- Regenerate Andrew_Rausch_CV.pdf.
- Add a CV Maintenance section to CLAUDE.md documenting the docx-source /
  generated-PDF workflow, the LibreOffice export recipe and its required
  packages, and the post-export checks (page count, column indent, diff).

Co-Authored-By: Claude Opus 4.8 <noreply@anthropic.com>
Claude-Session: https://claude.ai/code/session_01M9Ywo1C8JJM8e1gP6vdaDp
</commit_message>
<xml_diff>
--- a/Andrew_Rausch_CV.docx
+++ b/Andrew_Rausch_CV.docx
@@ -1223,20 +1223,21 @@
     <w:p>
       <w:pPr>
         <w:spacing w:after="0" w:line="240" w:lineRule="auto"/>
-        <w:rPr>
-          <w:sz w:val="24"/>
-          <w:szCs w:val="24"/>
-        </w:rPr>
-      </w:pPr>
-      <w:r>
-        <w:rPr>
-          <w:sz w:val="24"/>
-          <w:szCs w:val="24"/>
-          <w:rtl w:val="0"/>
-        </w:rPr>
-        <w:t xml:space="preserve">2021-present</w:t>
-        <w:tab/>
-        <w:t xml:space="preserve">Program Evaluation  Committee, MFM Fellowship, University of Chicago</w:t>
+        <w:ind w:left="1440"/>
+        <w:rPr>
+          <w:sz w:val="24"/>
+          <w:szCs w:val="24"/>
+        </w:rPr>
+      </w:pPr>
+      <w:r>
+        <w:rPr>
+          <w:sz w:val="24"/>
+          <w:szCs w:val="24"/>
+          <w:rtl w:val="0"/>
+        </w:rPr>
+        <w:t>2021-present</w:t>
+        <w:tab/>
+        <w:t>Program Evaluation Committee, MFM Fellowship, University of Chicago</w:t>
       </w:r>
     </w:p>
     <w:p>

</xml_diff>

<commit_message>
CV cleanup: fix bibliography lettering, mark chapters in press, update fellowship role
- Fix duplicate '(e)' in the bibliography; relabel Book chapters (f), Other
  works (g), Clinical trials (h), Works in review (i).
- Mark the three Obstetric Imaging chapters 'In press.'; add year to the
  postbariatric chapter and normalize its author initials.
- Site Director -> Associate Program Director, MFM Fellowship (CV + resume.html).
- Fix stray tab in the ad hoc reviewer line.
- Compact the four empty bibliography categories to keep the CV at 5 pages.

Co-Authored-By: Claude Opus 4.8 <noreply@anthropic.com>
Claude-Session: https://claude.ai/code/session_01M9Ywo1C8JJM8e1gP6vdaDp
</commit_message>
<xml_diff>
--- a/Andrew_Rausch_CV.docx
+++ b/Andrew_Rausch_CV.docx
@@ -1085,7 +1085,7 @@
           <w:szCs w:val="24"/>
           <w:rtl w:val="0"/>
         </w:rPr>
-        <w:t xml:space="preserve">Site Director, MFM Fellowship, University of Chicago</w:t>
+        <w:t>Associate Program Director, MFM Fellowship, University of Chicago</w:t>
       </w:r>
     </w:p>
     <w:p>
@@ -1498,7 +1498,7 @@
         <w:rPr>
           <w:rtl w:val="0"/>
         </w:rPr>
-        <w:tab/>
+        <w:t xml:space="preserve"> </w:t>
       </w:r>
       <w:r>
         <w:rPr>
@@ -2146,159 +2146,132 @@
       <w:pPr>
         <w:spacing w:after="0" w:line="240" w:lineRule="auto"/>
         <w:rPr>
+          <w:sz w:val="24"/>
+          <w:szCs w:val="24"/>
+        </w:rPr>
+      </w:pPr>
+      <w:r>
+        <w:rPr>
+          <w:b w:val="1"/>
+          <w:bCs w:val="1"/>
+          <w:sz w:val="24"/>
+          <w:szCs w:val="24"/>
+          <w:rtl w:val="0"/>
+        </w:rPr>
+        <w:t xml:space="preserve">(c) Peer-reviewed works accepted or in press</w:t>
+      </w:r>
+      <w:r>
+        <w:rPr>
+          <w:rtl w:val="0"/>
+        </w:rPr>
+      </w:r>
+    </w:p>
+    <w:p>
+      <w:pPr>
+        <w:spacing w:after="0" w:line="240" w:lineRule="auto"/>
+        <w:rPr>
+          <w:sz w:val="24"/>
+          <w:szCs w:val="24"/>
+        </w:rPr>
+      </w:pPr>
+      <w:r>
+        <w:rPr>
           <w:i w:val="1"/>
           <w:iCs w:val="1"/>
           <w:sz w:val="24"/>
           <w:szCs w:val="24"/>
-        </w:rPr>
-      </w:pPr>
-      <w:r>
-        <w:rPr>
-          <w:rtl w:val="0"/>
-        </w:rPr>
-      </w:r>
-    </w:p>
-    <w:p>
-      <w:pPr>
-        <w:spacing w:after="0" w:line="240" w:lineRule="auto"/>
-        <w:rPr>
-          <w:sz w:val="24"/>
-          <w:szCs w:val="24"/>
-        </w:rPr>
-      </w:pPr>
-      <w:r>
-        <w:rPr>
-          <w:b w:val="1"/>
-          <w:bCs w:val="1"/>
-          <w:sz w:val="24"/>
-          <w:szCs w:val="24"/>
-          <w:rtl w:val="0"/>
-        </w:rPr>
-        <w:t xml:space="preserve">(c) Peer-reviewed works accepted or in press</w:t>
-      </w:r>
-      <w:r>
-        <w:rPr>
-          <w:rtl w:val="0"/>
-        </w:rPr>
-      </w:r>
-    </w:p>
-    <w:p>
-      <w:pPr>
-        <w:spacing w:after="0" w:line="240" w:lineRule="auto"/>
-        <w:rPr>
-          <w:sz w:val="24"/>
-          <w:szCs w:val="24"/>
-        </w:rPr>
-      </w:pPr>
-      <w:r>
+          <w:rtl w:val="0"/>
+        </w:rPr>
+        <w:t xml:space="preserve">None</w:t>
+      </w:r>
+      <w:r>
+        <w:rPr>
+          <w:rtl w:val="0"/>
+        </w:rPr>
+      </w:r>
+    </w:p>
+    <w:p>
+      <w:pPr>
+        <w:spacing w:after="0" w:line="240" w:lineRule="auto"/>
+        <w:rPr>
+          <w:b w:val="1"/>
+          <w:bCs w:val="1"/>
+          <w:sz w:val="24"/>
+          <w:szCs w:val="24"/>
+        </w:rPr>
+      </w:pPr>
+      <w:r>
+        <w:rPr>
+          <w:b w:val="1"/>
+          <w:bCs w:val="1"/>
+          <w:sz w:val="24"/>
+          <w:szCs w:val="24"/>
+          <w:rtl w:val="0"/>
+        </w:rPr>
+        <w:t xml:space="preserve">(d) Non-peer-reviewed original articles</w:t>
+      </w:r>
+    </w:p>
+    <w:p>
+      <w:pPr>
+        <w:spacing w:after="0" w:line="240" w:lineRule="auto"/>
         <w:rPr>
           <w:i w:val="1"/>
           <w:iCs w:val="1"/>
           <w:sz w:val="24"/>
           <w:szCs w:val="24"/>
-          <w:rtl w:val="0"/>
-        </w:rPr>
-        <w:t xml:space="preserve">None</w:t>
-      </w:r>
-      <w:r>
-        <w:rPr>
-          <w:rtl w:val="0"/>
-        </w:rPr>
-      </w:r>
-    </w:p>
-    <w:p>
-      <w:pPr>
-        <w:spacing w:after="0" w:line="240" w:lineRule="auto"/>
-        <w:rPr>
-          <w:b w:val="1"/>
-          <w:bCs w:val="1"/>
-          <w:sz w:val="24"/>
-          <w:szCs w:val="24"/>
-        </w:rPr>
-      </w:pPr>
-      <w:r>
-        <w:rPr>
-          <w:rtl w:val="0"/>
-        </w:rPr>
-      </w:r>
-    </w:p>
-    <w:p>
-      <w:pPr>
-        <w:spacing w:after="0" w:line="240" w:lineRule="auto"/>
-        <w:rPr>
-          <w:b w:val="1"/>
-          <w:bCs w:val="1"/>
-          <w:sz w:val="24"/>
-          <w:szCs w:val="24"/>
-        </w:rPr>
-      </w:pPr>
-      <w:r>
-        <w:rPr>
-          <w:b w:val="1"/>
-          <w:bCs w:val="1"/>
-          <w:sz w:val="24"/>
-          <w:szCs w:val="24"/>
-          <w:rtl w:val="0"/>
-        </w:rPr>
-        <w:t xml:space="preserve">(d) Non-peer-reviewed original articles</w:t>
-      </w:r>
-    </w:p>
-    <w:p>
-      <w:pPr>
-        <w:spacing w:after="0" w:line="240" w:lineRule="auto"/>
+        </w:rPr>
+      </w:pPr>
+      <w:r>
         <w:rPr>
           <w:i w:val="1"/>
           <w:iCs w:val="1"/>
           <w:sz w:val="24"/>
           <w:szCs w:val="24"/>
-        </w:rPr>
-      </w:pPr>
-      <w:r>
+          <w:rtl w:val="0"/>
+        </w:rPr>
+        <w:t xml:space="preserve">None</w:t>
+      </w:r>
+    </w:p>
+    <w:p>
+      <w:pPr>
+        <w:spacing w:after="0" w:line="240" w:lineRule="auto"/>
+        <w:rPr>
+          <w:b w:val="1"/>
+          <w:bCs w:val="1"/>
+          <w:sz w:val="24"/>
+          <w:szCs w:val="24"/>
+        </w:rPr>
+      </w:pPr>
+      <w:r>
+        <w:rPr>
+          <w:b w:val="1"/>
+          <w:bCs w:val="1"/>
+          <w:sz w:val="24"/>
+          <w:szCs w:val="24"/>
+          <w:rtl w:val="0"/>
+        </w:rPr>
+        <w:t xml:space="preserve">(e) Books</w:t>
+      </w:r>
+    </w:p>
+    <w:p>
+      <w:pPr>
+        <w:spacing w:after="0" w:line="240" w:lineRule="auto"/>
         <w:rPr>
           <w:i w:val="1"/>
           <w:iCs w:val="1"/>
           <w:sz w:val="24"/>
           <w:szCs w:val="24"/>
-          <w:rtl w:val="0"/>
-        </w:rPr>
-        <w:t xml:space="preserve">None</w:t>
-      </w:r>
-    </w:p>
-    <w:p>
-      <w:pPr>
-        <w:spacing w:after="0" w:line="240" w:lineRule="auto"/>
+        </w:rPr>
+      </w:pPr>
+      <w:r>
         <w:rPr>
           <w:i w:val="1"/>
           <w:iCs w:val="1"/>
           <w:sz w:val="24"/>
           <w:szCs w:val="24"/>
-        </w:rPr>
-      </w:pPr>
-      <w:r>
-        <w:rPr>
-          <w:rtl w:val="0"/>
-        </w:rPr>
-      </w:r>
-    </w:p>
-    <w:p>
-      <w:pPr>
-        <w:spacing w:after="0" w:line="240" w:lineRule="auto"/>
-        <w:rPr>
-          <w:b w:val="1"/>
-          <w:bCs w:val="1"/>
-          <w:sz w:val="24"/>
-          <w:szCs w:val="24"/>
-        </w:rPr>
-      </w:pPr>
-      <w:r>
-        <w:rPr>
-          <w:b w:val="1"/>
-          <w:bCs w:val="1"/>
-          <w:sz w:val="24"/>
-          <w:szCs w:val="24"/>
-          <w:rtl w:val="0"/>
-        </w:rPr>
-        <w:t xml:space="preserve">(e) Books</w:t>
+          <w:rtl w:val="0"/>
+        </w:rPr>
+        <w:t xml:space="preserve">None</w:t>
       </w:r>
     </w:p>
     <w:p>
@@ -2313,197 +2286,176 @@
       </w:pPr>
       <w:r>
         <w:rPr>
-          <w:i w:val="1"/>
-          <w:iCs w:val="1"/>
-          <w:sz w:val="24"/>
-          <w:szCs w:val="24"/>
-          <w:rtl w:val="0"/>
-        </w:rPr>
-        <w:t xml:space="preserve">None</w:t>
-      </w:r>
-    </w:p>
-    <w:p>
-      <w:pPr>
-        <w:spacing w:after="0" w:line="240" w:lineRule="auto"/>
-        <w:rPr>
-          <w:i w:val="1"/>
-          <w:iCs w:val="1"/>
-          <w:sz w:val="24"/>
-          <w:szCs w:val="24"/>
-        </w:rPr>
-      </w:pPr>
-      <w:r>
-        <w:rPr>
-          <w:rtl w:val="0"/>
-        </w:rPr>
-      </w:r>
-    </w:p>
-    <w:p>
-      <w:pPr>
-        <w:spacing w:after="0" w:line="240" w:lineRule="auto"/>
-        <w:rPr>
-          <w:b w:val="1"/>
-          <w:bCs w:val="1"/>
-          <w:sz w:val="24"/>
-          <w:szCs w:val="24"/>
-        </w:rPr>
-      </w:pPr>
-      <w:r>
-        <w:rPr>
-          <w:b w:val="1"/>
-          <w:bCs w:val="1"/>
-          <w:sz w:val="24"/>
-          <w:szCs w:val="24"/>
-          <w:rtl w:val="0"/>
-        </w:rPr>
-        <w:t xml:space="preserve">(e) Book chapters</w:t>
-      </w:r>
-    </w:p>
-    <w:p>
-      <w:pPr>
-        <w:spacing w:after="0" w:line="240" w:lineRule="auto"/>
-        <w:rPr>
-          <w:sz w:val="24"/>
-          <w:szCs w:val="24"/>
-        </w:rPr>
-      </w:pPr>
-      <w:r>
-        <w:rPr>
-          <w:sz w:val="24"/>
-          <w:szCs w:val="24"/>
-          <w:rtl w:val="0"/>
-        </w:rPr>
-        <w:t xml:space="preserve">Meirowitz N, Sharma R, Rausch, AC. Antenatal care for postbariatric women, in Mahmood T, Arulkumaran S &amp; Chervenak FA (2nd ed) Obesity and Obstetrics. pp 105-115</w:t>
-      </w:r>
-    </w:p>
-    <w:p>
-      <w:pPr>
-        <w:spacing w:after="0" w:line="240" w:lineRule="auto"/>
-        <w:rPr>
-          <w:sz w:val="24"/>
-          <w:szCs w:val="24"/>
-        </w:rPr>
-      </w:pPr>
-      <w:r>
-        <w:rPr>
-          <w:rtl w:val="0"/>
-        </w:rPr>
-      </w:r>
-    </w:p>
-    <w:p>
-      <w:pPr>
-        <w:spacing w:after="0" w:line="240" w:lineRule="auto"/>
-        <w:rPr>
-          <w:sz w:val="24"/>
-          <w:szCs w:val="24"/>
-        </w:rPr>
-      </w:pPr>
-      <w:r>
-        <w:rPr>
-          <w:sz w:val="24"/>
-          <w:szCs w:val="24"/>
-          <w:rtl w:val="0"/>
-        </w:rPr>
-        <w:t xml:space="preserve">Rausch AC, Longman RE. CHARGE Syndrome, in Copel J, D’Alton ME, Feltovich H, et al. Obstetric Imaging: Fetal Diagnosis and Care, 3rd Ed.</w:t>
-      </w:r>
-    </w:p>
-    <w:p>
-      <w:pPr>
-        <w:spacing w:after="0" w:line="240" w:lineRule="auto"/>
-        <w:rPr>
-          <w:sz w:val="24"/>
-          <w:szCs w:val="24"/>
-        </w:rPr>
-      </w:pPr>
-      <w:r>
-        <w:rPr>
-          <w:rtl w:val="0"/>
-        </w:rPr>
-      </w:r>
-    </w:p>
-    <w:p>
-      <w:pPr>
-        <w:spacing w:after="0" w:line="240" w:lineRule="auto"/>
-        <w:rPr>
-          <w:sz w:val="24"/>
-          <w:szCs w:val="24"/>
-        </w:rPr>
-      </w:pPr>
-      <w:r>
-        <w:rPr>
-          <w:sz w:val="24"/>
-          <w:szCs w:val="24"/>
-          <w:rtl w:val="0"/>
-        </w:rPr>
-        <w:t xml:space="preserve">Rausch AC, Longman RE. Klippel-Trenaunay-Weber Syndrome, in Copel J, D’Alton ME, Feltovich H, et al. Obstetric Imaging: Fetal Diagnosis and Care, 3rd Ed.</w:t>
-      </w:r>
-    </w:p>
-    <w:p>
-      <w:pPr>
-        <w:spacing w:after="0" w:line="240" w:lineRule="auto"/>
-        <w:rPr>
-          <w:sz w:val="24"/>
-          <w:szCs w:val="24"/>
-        </w:rPr>
-      </w:pPr>
-      <w:r>
-        <w:rPr>
-          <w:rtl w:val="0"/>
-        </w:rPr>
-      </w:r>
-    </w:p>
-    <w:p>
-      <w:pPr>
-        <w:spacing w:after="0" w:line="240" w:lineRule="auto"/>
-        <w:rPr>
-          <w:sz w:val="24"/>
-          <w:szCs w:val="24"/>
-        </w:rPr>
-      </w:pPr>
-      <w:r>
-        <w:rPr>
-          <w:sz w:val="24"/>
-          <w:szCs w:val="24"/>
-          <w:rtl w:val="0"/>
-        </w:rPr>
-        <w:t xml:space="preserve">Rausch AC, Longman RE. Neu-Laxova Syndrome, in Copel J, D’Alton ME, Feltovich H, et al. Obstetric Imaging: Fetal Diagnosis and Care, 3rd Ed.</w:t>
-      </w:r>
-    </w:p>
-    <w:p>
-      <w:pPr>
-        <w:spacing w:after="0" w:line="240" w:lineRule="auto"/>
-        <w:rPr>
-          <w:b w:val="1"/>
-          <w:bCs w:val="1"/>
-          <w:sz w:val="24"/>
-          <w:szCs w:val="24"/>
-        </w:rPr>
-      </w:pPr>
-      <w:r>
-        <w:rPr>
-          <w:rtl w:val="0"/>
-        </w:rPr>
-      </w:r>
-    </w:p>
-    <w:p>
-      <w:pPr>
-        <w:spacing w:after="0" w:line="240" w:lineRule="auto"/>
-        <w:rPr>
-          <w:b w:val="1"/>
-          <w:bCs w:val="1"/>
-          <w:sz w:val="24"/>
-          <w:szCs w:val="24"/>
-        </w:rPr>
-      </w:pPr>
-      <w:r>
-        <w:rPr>
-          <w:b w:val="1"/>
-          <w:bCs w:val="1"/>
-          <w:sz w:val="24"/>
-          <w:szCs w:val="24"/>
-          <w:rtl w:val="0"/>
-        </w:rPr>
-        <w:t xml:space="preserve">(f) Other works</w:t>
+          <w:rtl w:val="0"/>
+        </w:rPr>
+      </w:r>
+    </w:p>
+    <w:p>
+      <w:pPr>
+        <w:spacing w:after="0" w:line="240" w:lineRule="auto"/>
+        <w:rPr>
+          <w:b w:val="1"/>
+          <w:bCs w:val="1"/>
+          <w:sz w:val="24"/>
+          <w:szCs w:val="24"/>
+        </w:rPr>
+      </w:pPr>
+      <w:r>
+        <w:rPr>
+          <w:b w:val="1"/>
+          <w:bCs w:val="1"/>
+          <w:sz w:val="24"/>
+          <w:szCs w:val="24"/>
+          <w:rtl w:val="0"/>
+        </w:rPr>
+        <w:t>(f) Book chapters</w:t>
+      </w:r>
+    </w:p>
+    <w:p>
+      <w:pPr>
+        <w:spacing w:after="0" w:line="240" w:lineRule="auto"/>
+        <w:rPr>
+          <w:sz w:val="24"/>
+          <w:szCs w:val="24"/>
+        </w:rPr>
+      </w:pPr>
+      <w:r>
+        <w:rPr>
+          <w:sz w:val="24"/>
+          <w:szCs w:val="24"/>
+          <w:rtl w:val="0"/>
+        </w:rPr>
+        <w:t>Meirowitz N, Sharma R, Rausch AC. Antenatal care for postbariatric women, in Mahmood T, Arulkumaran S &amp; Chervenak FA (2nd ed) Obesity and Obstetrics. pp 105-115. 2020</w:t>
+      </w:r>
+    </w:p>
+    <w:p>
+      <w:pPr>
+        <w:spacing w:after="0" w:line="240" w:lineRule="auto"/>
+        <w:rPr>
+          <w:sz w:val="24"/>
+          <w:szCs w:val="24"/>
+        </w:rPr>
+      </w:pPr>
+      <w:r>
+        <w:rPr>
+          <w:rtl w:val="0"/>
+        </w:rPr>
+      </w:r>
+    </w:p>
+    <w:p>
+      <w:pPr>
+        <w:spacing w:after="0" w:line="240" w:lineRule="auto"/>
+        <w:rPr>
+          <w:sz w:val="24"/>
+          <w:szCs w:val="24"/>
+        </w:rPr>
+      </w:pPr>
+      <w:r>
+        <w:rPr>
+          <w:sz w:val="24"/>
+          <w:szCs w:val="24"/>
+          <w:rtl w:val="0"/>
+        </w:rPr>
+        <w:t>Rausch AC, Longman RE. CHARGE Syndrome, in Copel J, D’Alton ME, Feltovich H, et al. Obstetric Imaging: Fetal Diagnosis and Care, 3rd Ed. In press.</w:t>
+      </w:r>
+    </w:p>
+    <w:p>
+      <w:pPr>
+        <w:spacing w:after="0" w:line="240" w:lineRule="auto"/>
+        <w:rPr>
+          <w:sz w:val="24"/>
+          <w:szCs w:val="24"/>
+        </w:rPr>
+      </w:pPr>
+      <w:r>
+        <w:rPr>
+          <w:rtl w:val="0"/>
+        </w:rPr>
+      </w:r>
+    </w:p>
+    <w:p>
+      <w:pPr>
+        <w:spacing w:after="0" w:line="240" w:lineRule="auto"/>
+        <w:rPr>
+          <w:sz w:val="24"/>
+          <w:szCs w:val="24"/>
+        </w:rPr>
+      </w:pPr>
+      <w:r>
+        <w:rPr>
+          <w:sz w:val="24"/>
+          <w:szCs w:val="24"/>
+          <w:rtl w:val="0"/>
+        </w:rPr>
+        <w:t>Rausch AC, Longman RE. Klippel-Trenaunay-Weber Syndrome, in Copel J, D’Alton ME, Feltovich H, et al. Obstetric Imaging: Fetal Diagnosis and Care, 3rd Ed. In press.</w:t>
+      </w:r>
+    </w:p>
+    <w:p>
+      <w:pPr>
+        <w:spacing w:after="0" w:line="240" w:lineRule="auto"/>
+        <w:rPr>
+          <w:sz w:val="24"/>
+          <w:szCs w:val="24"/>
+        </w:rPr>
+      </w:pPr>
+      <w:r>
+        <w:rPr>
+          <w:rtl w:val="0"/>
+        </w:rPr>
+      </w:r>
+    </w:p>
+    <w:p>
+      <w:pPr>
+        <w:spacing w:after="0" w:line="240" w:lineRule="auto"/>
+        <w:rPr>
+          <w:sz w:val="24"/>
+          <w:szCs w:val="24"/>
+        </w:rPr>
+      </w:pPr>
+      <w:r>
+        <w:rPr>
+          <w:sz w:val="24"/>
+          <w:szCs w:val="24"/>
+          <w:rtl w:val="0"/>
+        </w:rPr>
+        <w:t>Rausch AC, Longman RE. Neu-Laxova Syndrome, in Copel J, D’Alton ME, Feltovich H, et al. Obstetric Imaging: Fetal Diagnosis and Care, 3rd Ed. In press.</w:t>
+      </w:r>
+    </w:p>
+    <w:p>
+      <w:pPr>
+        <w:spacing w:after="0" w:line="240" w:lineRule="auto"/>
+        <w:rPr>
+          <w:b w:val="1"/>
+          <w:bCs w:val="1"/>
+          <w:sz w:val="24"/>
+          <w:szCs w:val="24"/>
+        </w:rPr>
+      </w:pPr>
+      <w:r>
+        <w:rPr>
+          <w:rtl w:val="0"/>
+        </w:rPr>
+      </w:r>
+    </w:p>
+    <w:p>
+      <w:pPr>
+        <w:spacing w:after="0" w:line="240" w:lineRule="auto"/>
+        <w:rPr>
+          <w:b w:val="1"/>
+          <w:bCs w:val="1"/>
+          <w:sz w:val="24"/>
+          <w:szCs w:val="24"/>
+        </w:rPr>
+      </w:pPr>
+      <w:r>
+        <w:rPr>
+          <w:b w:val="1"/>
+          <w:bCs w:val="1"/>
+          <w:sz w:val="24"/>
+          <w:szCs w:val="24"/>
+          <w:rtl w:val="0"/>
+        </w:rPr>
+        <w:t>(g) Other works</w:t>
       </w:r>
     </w:p>
     <w:p>
@@ -2665,7 +2617,7 @@
           <w:szCs w:val="24"/>
           <w:rtl w:val="0"/>
         </w:rPr>
-        <w:t xml:space="preserve">(g) Clinical trials ongoing, unpublished</w:t>
+        <w:t>(h) Clinical trials ongoing, unpublished</w:t>
       </w:r>
     </w:p>
     <w:p>
@@ -2748,7 +2700,7 @@
           <w:szCs w:val="24"/>
           <w:rtl w:val="0"/>
         </w:rPr>
-        <w:t xml:space="preserve">(h) Works in review, preparation, etc.</w:t>
+        <w:t>(i) Works in review, preparation, etc.</w:t>
       </w:r>
       <w:r>
         <w:rPr>

</xml_diff>

<commit_message>
CV: APD progression + working [TBC] scaffolds (stripped from served PDF)
- Split fellowship role to show progression: Site Director (2022-2026) ->
  Associate Program Director (2026-present); sync resume.html to 2026-present.
- Add [TBC] working-draft scaffolds to the docx for material still to gather:
  Teaching Activities (enumerate lectures), Clinical Activities & Program
  Development (Director of Ultrasound), national-meeting abstracts, works in
  preparation (sim study, curriculum abstract), upcoming Cancer in Pregnancy
  Center MFM lead, and NATAL/INCIP/GOOD registries.
- Served Andrew_Rausch_CV.pdf is generated from a copy with [TBC] lines
  stripped, so placeholders never reach the public site; document this step
  in CLAUDE.md. PDF stays 5 pages.

Co-Authored-By: Claude Opus 4.8 <noreply@anthropic.com>
Claude-Session: https://claude.ai/code/session_01M9Ywo1C8JJM8e1gP6vdaDp
</commit_message>
<xml_diff>
--- a/Andrew_Rausch_CV.docx
+++ b/Andrew_Rausch_CV.docx
@@ -953,6 +953,38 @@
     </w:p>
     <w:p>
       <w:pPr>
+        <w:spacing w:after="0"/>
+        <w:ind w:left="1440"/>
+      </w:pPr>
+      <w:r>
+        <w:rPr>
+          <w:b/>
+          <w:sz w:val="24"/>
+        </w:rPr>
+        <w:t>TEACHING ACTIVITIES [TBC]</w:t>
+      </w:r>
+    </w:p>
+    <w:p>
+      <w:pPr>
+        <w:spacing w:after="0"/>
+        <w:ind w:left="1440"/>
+      </w:pPr>
+      <w:r>
+        <w:rPr>
+          <w:i/>
+          <w:sz w:val="24"/>
+        </w:rPr>
+        <w:t>[TBC] Enumerate recurring didactics and lectures (resident / fellow / medical-student) and simulation sessions — to be completed; consolidate with Invited Talks so each talk appears once with co-presenters.</w:t>
+      </w:r>
+    </w:p>
+    <w:p>
+      <w:pPr>
+        <w:spacing w:after="0"/>
+        <w:ind w:left="1440"/>
+      </w:pPr>
+    </w:p>
+    <w:p>
+      <w:pPr>
         <w:spacing w:after="0" w:line="240" w:lineRule="auto"/>
         <w:ind w:left="1440"/>
         <w:rPr>
@@ -1018,6 +1050,19 @@
     </w:p>
     <w:p>
       <w:pPr>
+        <w:spacing w:after="0"/>
+        <w:ind w:left="1440"/>
+      </w:pPr>
+      <w:r>
+        <w:rPr>
+          <w:i/>
+          <w:sz w:val="24"/>
+        </w:rPr>
+        <w:t>[TBC] Upcoming: MFM Lead, Cancer in Pregnancy Center, University of Chicago (not yet started).</w:t>
+      </w:r>
+    </w:p>
+    <w:p>
+      <w:pPr>
         <w:spacing w:after="0" w:line="240" w:lineRule="auto"/>
         <w:ind w:left="1440"/>
         <w:rPr>
@@ -1071,6 +1116,52 @@
           <w:szCs w:val="24"/>
           <w:rtl w:val="0"/>
         </w:rPr>
+        <w:t>2026-present</w:t>
+      </w:r>
+      <w:r>
+        <w:rPr>
+          <w:rtl w:val="0"/>
+        </w:rPr>
+        <w:tab/>
+      </w:r>
+      <w:r>
+        <w:rPr>
+          <w:sz w:val="24"/>
+          <w:szCs w:val="24"/>
+          <w:rtl w:val="0"/>
+        </w:rPr>
+        <w:t>Associate Program Director, MFM Fellowship, University of Chicago</w:t>
+      </w:r>
+    </w:p>
+    <w:p>
+      <w:pPr>
+        <w:spacing w:after="0"/>
+        <w:ind w:left="1440"/>
+      </w:pPr>
+      <w:r>
+        <w:rPr>
+          <w:sz w:val="24"/>
+        </w:rPr>
+        <w:t>2022-2026</w:t>
+        <w:tab/>
+        <w:t>Site Director, MFM Fellowship, University of Chicago</w:t>
+      </w:r>
+    </w:p>
+    <w:p>
+      <w:pPr>
+        <w:spacing w:after="0" w:line="240" w:lineRule="auto"/>
+        <w:ind w:left="1440"/>
+        <w:rPr>
+          <w:sz w:val="24"/>
+          <w:szCs w:val="24"/>
+        </w:rPr>
+      </w:pPr>
+      <w:r>
+        <w:rPr>
+          <w:sz w:val="24"/>
+          <w:szCs w:val="24"/>
+          <w:rtl w:val="0"/>
+        </w:rPr>
         <w:t xml:space="preserve">2022-present</w:t>
       </w:r>
       <w:r>
@@ -1085,38 +1176,6 @@
           <w:szCs w:val="24"/>
           <w:rtl w:val="0"/>
         </w:rPr>
-        <w:t>Associate Program Director, MFM Fellowship, University of Chicago</w:t>
-      </w:r>
-    </w:p>
-    <w:p>
-      <w:pPr>
-        <w:spacing w:after="0" w:line="240" w:lineRule="auto"/>
-        <w:ind w:left="1440"/>
-        <w:rPr>
-          <w:sz w:val="24"/>
-          <w:szCs w:val="24"/>
-        </w:rPr>
-      </w:pPr>
-      <w:r>
-        <w:rPr>
-          <w:sz w:val="24"/>
-          <w:szCs w:val="24"/>
-          <w:rtl w:val="0"/>
-        </w:rPr>
-        <w:t xml:space="preserve">2022-present</w:t>
-      </w:r>
-      <w:r>
-        <w:rPr>
-          <w:rtl w:val="0"/>
-        </w:rPr>
-        <w:tab/>
-      </w:r>
-      <w:r>
-        <w:rPr>
-          <w:sz w:val="24"/>
-          <w:szCs w:val="24"/>
-          <w:rtl w:val="0"/>
-        </w:rPr>
         <w:t xml:space="preserve">Med Ed Champion (MFM), OB/Gyn residency, University of Chicago</w:t>
       </w:r>
     </w:p>
@@ -1273,6 +1332,38 @@
           <w:rtl w:val="0"/>
         </w:rPr>
       </w:r>
+    </w:p>
+    <w:p>
+      <w:pPr>
+        <w:spacing w:after="0"/>
+        <w:ind w:left="1440"/>
+      </w:pPr>
+      <w:r>
+        <w:rPr>
+          <w:b/>
+          <w:sz w:val="24"/>
+        </w:rPr>
+        <w:t>CLINICAL ACTIVITIES &amp; PROGRAM DEVELOPMENT [TBC]</w:t>
+      </w:r>
+    </w:p>
+    <w:p>
+      <w:pPr>
+        <w:spacing w:after="0"/>
+        <w:ind w:left="1440"/>
+      </w:pPr>
+      <w:r>
+        <w:rPr>
+          <w:i/>
+          <w:sz w:val="24"/>
+        </w:rPr>
+        <w:t>[TBC] Official program-development activities as Director of Ultrasound — to be completed (first-trimester / early-anatomy program + AIUM accreditation; targeted transabdominal &amp; transvaginal neurosonography; diagnostic &amp; dye amnioinfusion protocols; Ingalls Memorial expansion / transfer from Radiology; scan-volume metrics). Confirm official program names.</w:t>
+      </w:r>
+    </w:p>
+    <w:p>
+      <w:pPr>
+        <w:spacing w:after="0"/>
+        <w:ind w:left="1440"/>
+      </w:pPr>
     </w:p>
     <w:p>
       <w:pPr>
@@ -2473,6 +2564,18 @@
           <w:rtl w:val="0"/>
         </w:rPr>
         <w:t xml:space="preserve">Rausch AC, Segal O, Speicher A, Dimijian D, Rochelson B. Fetal weight estimation using neural networks. 2020 AIUM Annual Meeting. – Invited for oral presentation but not given due to COVID-19 related cancellation.</w:t>
+      </w:r>
+    </w:p>
+    <w:p>
+      <w:pPr>
+        <w:spacing w:after="0"/>
+      </w:pPr>
+      <w:r>
+        <w:rPr>
+          <w:i/>
+          <w:sz w:val="24"/>
+        </w:rPr>
+        <w:t>[TBC] Enumerate all national-meeting abstracts — ISUOG, APGO (simulation), ACOG, SMFM (authors, title, meeting, year, oral / poster).</w:t>
       </w:r>
     </w:p>
     <w:p>
@@ -2670,6 +2773,18 @@
     </w:p>
     <w:p>
       <w:pPr>
+        <w:spacing w:after="0"/>
+      </w:pPr>
+      <w:r>
+        <w:rPr>
+          <w:i/>
+          <w:sz w:val="24"/>
+        </w:rPr>
+        <w:t>[TBC] Add: NATAL study — co-investigator (unfunded; confirm official title / PI); INCIP registry (planned); confirm GOOD (Gastroschisis) registry entry above.</w:t>
+      </w:r>
+    </w:p>
+    <w:p>
+      <w:pPr>
         <w:spacing w:after="0" w:line="240" w:lineRule="auto"/>
         <w:rPr>
           <w:i w:val="1"/>
@@ -2723,6 +2838,18 @@
           <w:rtl w:val="0"/>
         </w:rPr>
         <w:t>None</w:t>
+      </w:r>
+    </w:p>
+    <w:p>
+      <w:pPr>
+        <w:spacing w:after="0"/>
+      </w:pPr>
+      <w:r>
+        <w:rPr>
+          <w:i/>
+          <w:sz w:val="24"/>
+        </w:rPr>
+        <w:t>[TBC] In preparation: simulation study (official title / abstract TBD); ultrasound curriculum abstract (APGO, senior author).</w:t>
       </w:r>
     </w:p>
     <w:sectPr>

</xml_diff>

<commit_message>
CV docx: scaffold Grants & Research Support (anticipated R01 co-PI, GE collaborations)
Working [TBC] notes only; served PDF is unchanged (placeholders stripped at
export, so nothing reaches the public site yet).

Co-Authored-By: Claude Opus 4.8 <noreply@anthropic.com>
Claude-Session: https://claude.ai/code/session_01M9Ywo1C8JJM8e1gP6vdaDp
</commit_message>
<xml_diff>
--- a/Andrew_Rausch_CV.docx
+++ b/Andrew_Rausch_CV.docx
@@ -1704,6 +1704,51 @@
           <w:rtl w:val="0"/>
         </w:rPr>
       </w:r>
+    </w:p>
+    <w:p>
+      <w:pPr>
+        <w:spacing w:after="0"/>
+        <w:ind w:left="1440"/>
+      </w:pPr>
+      <w:r>
+        <w:rPr>
+          <w:b/>
+          <w:sz w:val="24"/>
+        </w:rPr>
+        <w:t>GRANTS &amp; RESEARCH SUPPORT [TBC]</w:t>
+      </w:r>
+    </w:p>
+    <w:p>
+      <w:pPr>
+        <w:spacing w:after="0"/>
+        <w:ind w:left="1440"/>
+      </w:pPr>
+      <w:r>
+        <w:rPr>
+          <w:i/>
+          <w:sz w:val="24"/>
+        </w:rPr>
+        <w:t>[TBC] Anticipated: Co-Principal Investigator, R01 (0.1 FTE) — multimodal ovarian cancer characterization (MRI, ultrasound, proteomics, EHR) for differentiation, prognosis, and diagnosis of recurrence. Add status (submitted / scored / awarded), grant number, and contact PI.</w:t>
+      </w:r>
+    </w:p>
+    <w:p>
+      <w:pPr>
+        <w:spacing w:after="0"/>
+        <w:ind w:left="1440"/>
+      </w:pPr>
+      <w:r>
+        <w:rPr>
+          <w:i/>
+          <w:sz w:val="24"/>
+        </w:rPr>
+        <w:t>[TBC] Industry research collaborations — two collaborations with GE HealthCare providing in-kind ultrasound equipment (two loaner systems) to the unit. Add official agreement names/dates; verify consistency with institutional COI disclosure.</w:t>
+      </w:r>
+    </w:p>
+    <w:p>
+      <w:pPr>
+        <w:spacing w:after="0"/>
+        <w:ind w:left="1440"/>
+      </w:pPr>
     </w:p>
     <w:p>
       <w:pPr>

</xml_diff>

<commit_message>
CV: add SMFM 2026 poster, remove GOOD trial, name NATAL PI
- (g) Other works: add the accepted SMFM 2026 Global Congress poster
  (Boll ME, Chandrasekaran S, Sohail S, Rausch A, Premkumar A).
- (h) Clinical trials: remove the GOOD gastroschisis entry entirely rather
  than carrying it as on hold under an "ongoing" heading.
- (h) Clinical trials: spell out the NATAL PI as Ashish Premkumar MD PhD.
- (g) Other works: narrow the remaining scaffold to the ABOG Simulation
  Summit 2026 entry, which now has its author list but still needs a title.
- publications.html: mirror the SMFM poster under Selected Abstracts, per
  the CV/site sync rule.

PDF re-exported: 6 pages, no [TBC] text, diff limited to the intended lines.

Co-Authored-By: Claude Opus 5 <noreply@anthropic.com>
Claude-Session: https://claude.ai/code/session_01WvtvM9z3qsF79i4F6oBD7k
</commit_message>
<xml_diff>
--- a/Andrew_Rausch_CV.docx
+++ b/Andrew_Rausch_CV.docx
@@ -2827,10 +2827,31 @@
       </w:pPr>
       <w:r>
         <w:rPr>
+          <w:sz w:val="24"/>
+        </w:rPr>
+      </w:r>
+    </w:p>
+    <w:p>
+      <w:pPr>
+        <w:spacing w:after="0"/>
+      </w:pPr>
+      <w:r>
+        <w:rPr>
+          <w:sz w:val="24"/>
+        </w:rPr>
+        <w:t>Boll ME, Chandrasekaran S, Sohail S, Rausch A, Premkumar A. Relationship between placental efficiency score and adverse neonatal outcomes in pregnancies with fetal growth restriction. SMFM 2026 Global Congress, Utrecht, Netherlands. October 2026. Poster presentation.</w:t>
+      </w:r>
+    </w:p>
+    <w:p>
+      <w:pPr>
+        <w:spacing w:after="0"/>
+      </w:pPr>
+      <w:r>
+        <w:rPr>
           <w:i/>
           <w:sz w:val="24"/>
         </w:rPr>
-        <w:t>[TBC] Add accepted abstracts — SMFM 2026 Global Congress poster (“Relationship between placental efficiency score and adverse neonatal outcomes in pregnancies with fetal growth restriction,” Poster Session 1, 8 Oct 2026, Utrecht): need author list. ABOG Simulation Summit 2026 (Burns LP presenting): need title and author list.</w:t>
+        <w:t>[TBC] ABOG Simulation Summit 2026 — Evans C, Rausch AC, Burns LP. Need exact submission title.</w:t>
       </w:r>
     </w:p>
     <w:p>
@@ -2992,37 +3013,6 @@
           <w:szCs w:val="24"/>
           <w:rtl w:val="0"/>
         </w:rPr>
-        <w:t>GOOD - outcomes in Gastroschisis trial (on hold)</w:t>
-      </w:r>
-    </w:p>
-    <w:p>
-      <w:pPr>
-        <w:spacing w:after="0" w:line="240" w:lineRule="auto"/>
-        <w:rPr>
-          <w:sz w:val="24"/>
-          <w:szCs w:val="24"/>
-        </w:rPr>
-      </w:pPr>
-      <w:r>
-        <w:rPr>
-          <w:rtl w:val="0"/>
-        </w:rPr>
-      </w:r>
-    </w:p>
-    <w:p>
-      <w:pPr>
-        <w:spacing w:after="0" w:line="240" w:lineRule="auto"/>
-        <w:rPr>
-          <w:sz w:val="24"/>
-          <w:szCs w:val="24"/>
-        </w:rPr>
-      </w:pPr>
-      <w:r>
-        <w:rPr>
-          <w:sz w:val="24"/>
-          <w:szCs w:val="24"/>
-          <w:rtl w:val="0"/>
-        </w:rPr>
         <w:t xml:space="preserve">Quantitative Ultrasound Biomarkers for Gynecologic and Obstetric Imaging Across the Reproductive Lifespan, Heather Whitney PhD PI - Andrew Rausch, co-I, 0.1 FTE</w:t>
       </w:r>
     </w:p>
@@ -3032,10 +3022,20 @@
       </w:pPr>
       <w:r>
         <w:rPr>
+          <w:sz w:val="24"/>
+        </w:rPr>
+      </w:r>
+    </w:p>
+    <w:p>
+      <w:pPr>
+        <w:spacing w:after="0"/>
+      </w:pPr>
+      <w:r>
+        <w:rPr>
           <w:b w:val="0"/>
           <w:sz w:val="24"/>
         </w:rPr>
-        <w:t>NATAL study, A Premkumar MD PI - Andrew Rausch, co-I (unfunded)</w:t>
+        <w:t>NATAL study, Ashish Premkumar MD PhD PI - Andrew Rausch, co-I (unfunded)</w:t>
       </w:r>
     </w:p>
     <w:p>

</xml_diff>

<commit_message>
CV: use Andrew C Rausch / Rausch AC where the form is a choice
Preferred rendering includes the middle initial. Applied to the entries where
the name form is still ours to set:

- (g) SMFM 2026 poster author string: Rausch A -> Rausch AC (CV + publications.html).
- (h) Clinical trials self-descriptions: Andrew Rausch -> Andrew C Rausch.

Published citations that printed as "Rausch A" are deliberately left alone so
the bibliography continues to match the published record.

Co-Authored-By: Claude Opus 5 <noreply@anthropic.com>
Claude-Session: https://claude.ai/code/session_01WvtvM9z3qsF79i4F6oBD7k
</commit_message>
<xml_diff>
--- a/Andrew_Rausch_CV.docx
+++ b/Andrew_Rausch_CV.docx
@@ -2839,7 +2839,7 @@
         <w:rPr>
           <w:sz w:val="24"/>
         </w:rPr>
-        <w:t>Boll ME, Chandrasekaran S, Sohail S, Rausch A, Premkumar A. Relationship between placental efficiency score and adverse neonatal outcomes in pregnancies with fetal growth restriction. SMFM 2026 Global Congress, Utrecht, Netherlands. October 2026. Poster presentation.</w:t>
+        <w:t>Boll ME, Chandrasekaran S, Sohail S, Rausch AC, Premkumar A. Relationship between placental efficiency score and adverse neonatal outcomes in pregnancies with fetal growth restriction. SMFM 2026 Global Congress, Utrecht, Netherlands. October 2026. Poster presentation.</w:t>
       </w:r>
     </w:p>
     <w:p>
@@ -3013,7 +3013,7 @@
           <w:szCs w:val="24"/>
           <w:rtl w:val="0"/>
         </w:rPr>
-        <w:t xml:space="preserve">Quantitative Ultrasound Biomarkers for Gynecologic and Obstetric Imaging Across the Reproductive Lifespan, Heather Whitney PhD PI - Andrew Rausch, co-I, 0.1 FTE</w:t>
+        <w:t>Quantitative Ultrasound Biomarkers for Gynecologic and Obstetric Imaging Across the Reproductive Lifespan, Heather Whitney PhD PI - Andrew C Rausch, co-I, 0.1 FTE</w:t>
       </w:r>
     </w:p>
     <w:p>
@@ -3035,7 +3035,7 @@
           <w:b w:val="0"/>
           <w:sz w:val="24"/>
         </w:rPr>
-        <w:t>NATAL study, Ashish Premkumar MD PhD PI - Andrew Rausch, co-I (unfunded)</w:t>
+        <w:t>NATAL study, Ashish Premkumar MD PhD PI - Andrew C Rausch, co-I (unfunded)</w:t>
       </w:r>
     </w:p>
     <w:p>

</xml_diff>

<commit_message>
CV: add ultrasound curriculum development to Teaching Activities
- Ob/Gyn residency: add the Ultrasound rotation directorship and the novel
  resident curriculum in obstetric and gynecologic ultrasound.
- MFM fellowship: add authorship of the fellowship ultrasound education
  curriculum, including the advanced obstetric ultrasound curriculum.
- Restructure each group as a lead role/curriculum line plus a consolidated
  didactics line, so the curriculum work reads as accomplishment rather than
  sitting in a flat list of lecture titles.
- Mentees: add Leah Hefelfinger (PGY-3), ultrasound curriculum survey for
  Ob/Gyn residency programs.

PDF re-exported: still 6 pages, no [TBC] text, columns aligned.

Co-Authored-By: Claude Opus 5 <noreply@anthropic.com>
Claude-Session: https://claude.ai/code/session_01WvtvM9z3qsF79i4F6oBD7k
</commit_message>
<xml_diff>
--- a/Andrew_Rausch_CV.docx
+++ b/Andrew_Rausch_CV.docx
@@ -971,10 +971,9 @@
       </w:pPr>
       <w:r>
         <w:rPr>
-          <w:b w:val="0"/>
-          <w:sz w:val="24"/>
-        </w:rPr>
-        <w:t>Ob/Gyn Residency, University of Chicago — annual didactics</w:t>
+          <w:sz w:val="24"/>
+        </w:rPr>
+        <w:t>Ob/Gyn Residency, University of Chicago</w:t>
       </w:r>
     </w:p>
     <w:p>
@@ -984,10 +983,9 @@
       </w:pPr>
       <w:r>
         <w:rPr>
-          <w:b w:val="0"/>
-          <w:sz w:val="24"/>
-        </w:rPr>
-        <w:t>Embryology and Teratology</w:t>
+          <w:sz w:val="24"/>
+        </w:rPr>
+        <w:t>Rotation Director, Ultrasound — designed and implemented a novel curriculum for resident training in obstetric and gynecologic ultrasound</w:t>
       </w:r>
     </w:p>
     <w:p>
@@ -997,10 +995,31 @@
       </w:pPr>
       <w:r>
         <w:rPr>
-          <w:b w:val="0"/>
-          <w:sz w:val="24"/>
-        </w:rPr>
-        <w:t>Preterm Birth: Diagnosis and Prevention</w:t>
+          <w:sz w:val="24"/>
+        </w:rPr>
+        <w:t>Annual didactics: Embryology and Teratology; Preterm Birth — Diagnosis and Prevention; Fetal Growth Restriction and Antenatal Monitoring; Alloimmunization</w:t>
+      </w:r>
+    </w:p>
+    <w:p>
+      <w:pPr>
+        <w:spacing w:after="0"/>
+      </w:pPr>
+      <w:r>
+        <w:rPr>
+          <w:sz w:val="24"/>
+        </w:rPr>
+      </w:r>
+    </w:p>
+    <w:p>
+      <w:pPr>
+        <w:spacing w:after="0"/>
+        <w:ind w:left="1440"/>
+      </w:pPr>
+      <w:r>
+        <w:rPr>
+          <w:sz w:val="24"/>
+        </w:rPr>
+        <w:t>Maternal-Fetal Medicine Fellowship, University of Chicago</w:t>
       </w:r>
     </w:p>
     <w:p>
@@ -1010,10 +1029,9 @@
       </w:pPr>
       <w:r>
         <w:rPr>
-          <w:b w:val="0"/>
-          <w:sz w:val="24"/>
-        </w:rPr>
-        <w:t>Fetal Growth Restriction and Antenatal Monitoring</w:t>
+          <w:sz w:val="24"/>
+        </w:rPr>
+        <w:t>Designed the fellowship ultrasound education curriculum, including a novel curriculum in advanced obstetric ultrasound</w:t>
       </w:r>
     </w:p>
     <w:p>
@@ -1023,10 +1041,19 @@
       </w:pPr>
       <w:r>
         <w:rPr>
-          <w:b w:val="0"/>
-          <w:sz w:val="24"/>
-        </w:rPr>
-        <w:t>Alloimmunization</w:t>
+          <w:sz w:val="24"/>
+        </w:rPr>
+        <w:t>Annual didactics: Ultrasound Basics; Fetal CNS Ultrasound; Pulse Wave Doppler in Fetal Ultrasound; First Trimester Detailed Anatomy; Fundamentals of Needle Guided Intervention (FUNGI) simulation</w:t>
+      </w:r>
+    </w:p>
+    <w:p>
+      <w:pPr>
+        <w:spacing w:after="0"/>
+      </w:pPr>
+      <w:r>
+        <w:rPr>
+          <w:sz w:val="24"/>
+        </w:rPr>
       </w:r>
     </w:p>
     <w:p>
@@ -1036,10 +1063,9 @@
       </w:pPr>
       <w:r>
         <w:rPr>
-          <w:b w:val="0"/>
-          <w:sz w:val="24"/>
-        </w:rPr>
-        <w:t>Maternal-Fetal Medicine Fellowship, University of Chicago — annual didactics</w:t>
+          <w:sz w:val="24"/>
+        </w:rPr>
+        <w:t>Neonatology Fellowship, University of Chicago</w:t>
       </w:r>
     </w:p>
     <w:p>
@@ -1049,10 +1075,406 @@
       </w:pPr>
       <w:r>
         <w:rPr>
+          <w:sz w:val="24"/>
+        </w:rPr>
+        <w:t>Didactics: Maternal-Fetal Medicine Topics in NICU Care</w:t>
+      </w:r>
+    </w:p>
+    <w:p>
+      <w:pPr>
+        <w:spacing w:after="0"/>
+        <w:ind w:left="1440"/>
+      </w:pPr>
+    </w:p>
+    <w:p>
+      <w:pPr>
+        <w:spacing w:after="0" w:line="240" w:lineRule="auto"/>
+        <w:ind/>
+        <w:rPr>
+          <w:sz w:val="24"/>
+          <w:szCs w:val="24"/>
+        </w:rPr>
+      </w:pPr>
+      <w:r>
+        <w:rPr>
+          <w:b w:val="1"/>
+          <w:bCs w:val="1"/>
+          <w:sz w:val="24"/>
+          <w:szCs w:val="24"/>
+          <w:rtl w:val="0"/>
+        </w:rPr>
+        <w:t xml:space="preserve">INSTITUTIONAL &amp; PROGRAM POSITIONS</w:t>
+      </w:r>
+      <w:r>
+        <w:rPr>
+          <w:rtl w:val="0"/>
+        </w:rPr>
+      </w:r>
+    </w:p>
+    <w:p>
+      <w:pPr>
+        <w:spacing w:after="0" w:line="240" w:lineRule="auto"/>
+        <w:ind w:left="1440" w:firstLine="0"/>
+        <w:rPr>
+          <w:sz w:val="24"/>
+          <w:szCs w:val="24"/>
+        </w:rPr>
+      </w:pPr>
+      <w:r>
+        <w:rPr>
+          <w:sz w:val="24"/>
+          <w:szCs w:val="24"/>
+          <w:rtl w:val="0"/>
+        </w:rPr>
+        <w:t xml:space="preserve">2026-present</w:t>
+        <w:tab/>
+        <w:t xml:space="preserve">Director of Ultrasound, Department of Obstetrics &amp; Gynecology, University of Chicago</w:t>
+      </w:r>
+    </w:p>
+    <w:p>
+      <w:pPr>
+        <w:spacing w:after="0" w:line="240" w:lineRule="auto"/>
+        <w:ind w:left="1440" w:firstLine="0"/>
+        <w:rPr>
+          <w:sz w:val="24"/>
+          <w:szCs w:val="24"/>
+        </w:rPr>
+      </w:pPr>
+      <w:r>
+        <w:rPr>
+          <w:sz w:val="24"/>
+          <w:szCs w:val="24"/>
+          <w:rtl w:val="0"/>
+        </w:rPr>
+        <w:t xml:space="preserve">2025-present</w:t>
+        <w:tab/>
+        <w:t xml:space="preserve">MFM Lead, Pregnancy and Preconception in IBD clinic, University of Chicago</w:t>
+      </w:r>
+    </w:p>
+    <w:p>
+      <w:pPr>
+        <w:spacing w:after="0"/>
+        <w:ind w:left="1440"/>
+      </w:pPr>
+      <w:r>
+        <w:rPr>
+          <w:i/>
+          <w:sz w:val="24"/>
+        </w:rPr>
+        <w:t>[TBC] Upcoming: MFM Lead, Cancer in Pregnancy Center, University of Chicago (not yet started).</w:t>
+      </w:r>
+    </w:p>
+    <w:p>
+      <w:pPr>
+        <w:spacing w:after="0" w:line="240" w:lineRule="auto"/>
+        <w:ind w:left="1440"/>
+        <w:rPr>
+          <w:sz w:val="24"/>
+          <w:szCs w:val="24"/>
+        </w:rPr>
+      </w:pPr>
+      <w:r>
+        <w:rPr>
+          <w:sz w:val="24"/>
+          <w:szCs w:val="24"/>
+          <w:rtl w:val="0"/>
+        </w:rPr>
+        <w:t xml:space="preserve">2024-present</w:t>
+        <w:tab/>
+        <w:t xml:space="preserve">FBC Policy Committee, University of Chicago</w:t>
+      </w:r>
+    </w:p>
+    <w:p>
+      <w:pPr>
+        <w:spacing w:after="0" w:line="240" w:lineRule="auto"/>
+        <w:ind w:left="1440"/>
+        <w:rPr>
+          <w:sz w:val="24"/>
+          <w:szCs w:val="24"/>
+        </w:rPr>
+      </w:pPr>
+      <w:r>
+        <w:rPr>
+          <w:sz w:val="24"/>
+          <w:szCs w:val="24"/>
+          <w:rtl w:val="0"/>
+        </w:rPr>
+        <w:t xml:space="preserve">2022-present</w:t>
+        <w:tab/>
+        <w:t xml:space="preserve">Sub-internship lead, Antepartum and Birth Rooms Sub-I University of Chicago</w:t>
+      </w:r>
+    </w:p>
+    <w:p>
+      <w:pPr>
+        <w:spacing w:after="0" w:line="240" w:lineRule="auto"/>
+        <w:ind w:left="1440"/>
+        <w:rPr>
+          <w:sz w:val="24"/>
+          <w:szCs w:val="24"/>
+        </w:rPr>
+      </w:pPr>
+      <w:r>
+        <w:rPr>
+          <w:sz w:val="24"/>
+          <w:szCs w:val="24"/>
+          <w:rtl w:val="0"/>
+        </w:rPr>
+        <w:t>2026-present</w:t>
+      </w:r>
+      <w:r>
+        <w:rPr>
+          <w:rtl w:val="0"/>
+        </w:rPr>
+        <w:tab/>
+      </w:r>
+      <w:r>
+        <w:rPr>
+          <w:sz w:val="24"/>
+          <w:szCs w:val="24"/>
+          <w:rtl w:val="0"/>
+        </w:rPr>
+        <w:t>Associate Program Director, MFM Fellowship, University of Chicago</w:t>
+      </w:r>
+    </w:p>
+    <w:p>
+      <w:pPr>
+        <w:spacing w:after="0"/>
+        <w:ind w:left="1440"/>
+      </w:pPr>
+      <w:r>
+        <w:rPr>
+          <w:sz w:val="24"/>
+        </w:rPr>
+        <w:t>2022-2026</w:t>
+        <w:tab/>
+        <w:t>Site Director, MFM Fellowship, University of Chicago</w:t>
+      </w:r>
+    </w:p>
+    <w:p>
+      <w:pPr>
+        <w:spacing w:after="0" w:line="240" w:lineRule="auto"/>
+        <w:ind w:left="1440"/>
+        <w:rPr>
+          <w:sz w:val="24"/>
+          <w:szCs w:val="24"/>
+        </w:rPr>
+      </w:pPr>
+      <w:r>
+        <w:rPr>
+          <w:sz w:val="24"/>
+          <w:szCs w:val="24"/>
+          <w:rtl w:val="0"/>
+        </w:rPr>
+        <w:t xml:space="preserve">2022-present</w:t>
+      </w:r>
+      <w:r>
+        <w:rPr>
+          <w:rtl w:val="0"/>
+        </w:rPr>
+        <w:tab/>
+      </w:r>
+      <w:r>
+        <w:rPr>
+          <w:sz w:val="24"/>
+          <w:szCs w:val="24"/>
+          <w:rtl w:val="0"/>
+        </w:rPr>
+        <w:t xml:space="preserve">Med Ed Champion (MFM), OB/Gyn residency, University of Chicago</w:t>
+      </w:r>
+    </w:p>
+    <w:p>
+      <w:pPr>
+        <w:spacing w:after="0" w:line="240" w:lineRule="auto"/>
+        <w:ind w:left="1440"/>
+        <w:rPr>
+          <w:sz w:val="24"/>
+          <w:szCs w:val="24"/>
+        </w:rPr>
+      </w:pPr>
+      <w:r>
+        <w:rPr>
+          <w:sz w:val="24"/>
+          <w:szCs w:val="24"/>
+          <w:rtl w:val="0"/>
+        </w:rPr>
+        <w:t xml:space="preserve">2021-present</w:t>
+        <w:tab/>
+        <w:t xml:space="preserve">Resident Recruitment Committee, University of Chicago</w:t>
+      </w:r>
+    </w:p>
+    <w:p>
+      <w:pPr>
+        <w:spacing w:after="0" w:line="240" w:lineRule="auto"/>
+        <w:ind w:left="1440"/>
+        <w:rPr>
+          <w:sz w:val="24"/>
+          <w:szCs w:val="24"/>
+        </w:rPr>
+      </w:pPr>
+      <w:r>
+        <w:rPr>
+          <w:sz w:val="24"/>
+          <w:szCs w:val="24"/>
+          <w:rtl w:val="0"/>
+        </w:rPr>
+        <w:t xml:space="preserve">2021-present</w:t>
+        <w:tab/>
+        <w:t xml:space="preserve">MFM Fellow Recruitment Committee, University of Chicago</w:t>
+      </w:r>
+    </w:p>
+    <w:p>
+      <w:pPr>
+        <w:spacing w:after="0" w:line="240" w:lineRule="auto"/>
+        <w:ind w:left="1440"/>
+        <w:rPr>
+          <w:sz w:val="24"/>
+          <w:szCs w:val="24"/>
+        </w:rPr>
+      </w:pPr>
+      <w:r>
+        <w:rPr>
+          <w:sz w:val="24"/>
+          <w:szCs w:val="24"/>
+          <w:rtl w:val="0"/>
+        </w:rPr>
+        <w:t xml:space="preserve">2021-present</w:t>
+        <w:tab/>
+        <w:t xml:space="preserve">Clinical Competency Committee, Ob/Gyn residency, University of Chicago</w:t>
+      </w:r>
+    </w:p>
+    <w:p>
+      <w:pPr>
+        <w:spacing w:after="0" w:line="240" w:lineRule="auto"/>
+        <w:ind w:left="1440"/>
+        <w:rPr>
+          <w:sz w:val="24"/>
+          <w:szCs w:val="24"/>
+        </w:rPr>
+      </w:pPr>
+      <w:r>
+        <w:rPr>
+          <w:sz w:val="24"/>
+          <w:szCs w:val="24"/>
+          <w:rtl w:val="0"/>
+        </w:rPr>
+        <w:t xml:space="preserve">2021-present</w:t>
+        <w:tab/>
+        <w:t xml:space="preserve">Clinical Competency Committee, MFM Fellowship, University of Chicago</w:t>
+      </w:r>
+    </w:p>
+    <w:p>
+      <w:pPr>
+        <w:spacing w:after="0" w:line="240" w:lineRule="auto"/>
+        <w:ind w:left="1440"/>
+        <w:rPr>
+          <w:sz w:val="24"/>
+          <w:szCs w:val="24"/>
+        </w:rPr>
+      </w:pPr>
+      <w:r>
+        <w:rPr>
+          <w:sz w:val="24"/>
+          <w:szCs w:val="24"/>
+          <w:rtl w:val="0"/>
+        </w:rPr>
+        <w:t xml:space="preserve">2021-present</w:t>
+        <w:tab/>
+        <w:t xml:space="preserve">Program Evaluation Committee, Ob/Gyn residency, University of Chicago</w:t>
+      </w:r>
+    </w:p>
+    <w:p>
+      <w:pPr>
+        <w:spacing w:after="0" w:line="240" w:lineRule="auto"/>
+        <w:ind w:left="1440"/>
+        <w:rPr>
+          <w:sz w:val="24"/>
+          <w:szCs w:val="24"/>
+        </w:rPr>
+      </w:pPr>
+      <w:r>
+        <w:rPr>
+          <w:sz w:val="24"/>
+          <w:szCs w:val="24"/>
+          <w:rtl w:val="0"/>
+        </w:rPr>
+        <w:t>2021-present</w:t>
+        <w:tab/>
+        <w:t>Program Evaluation Committee, MFM Fellowship, University of Chicago</w:t>
+      </w:r>
+    </w:p>
+    <w:p>
+      <w:pPr>
+        <w:spacing w:after="0" w:line="240" w:lineRule="auto"/>
+        <w:ind w:left="1440"/>
+        <w:rPr>
+          <w:sz w:val="24"/>
+          <w:szCs w:val="24"/>
+        </w:rPr>
+      </w:pPr>
+      <w:r>
+        <w:rPr>
+          <w:sz w:val="24"/>
+          <w:szCs w:val="24"/>
+          <w:rtl w:val="0"/>
+        </w:rPr>
+        <w:t xml:space="preserve">2019-2021</w:t>
+        <w:tab/>
+        <w:t xml:space="preserve">Program Evaluation Committee, Fellow Representative, MFM Fellowship, Northwell Health/Hofstra University</w:t>
+      </w:r>
+    </w:p>
+    <w:p>
+      <w:pPr>
+        <w:spacing w:after="0" w:line="240" w:lineRule="auto"/>
+        <w:rPr>
+          <w:sz w:val="24"/>
+          <w:szCs w:val="24"/>
+        </w:rPr>
+      </w:pPr>
+      <w:r>
+        <w:rPr>
+          <w:rtl w:val="0"/>
+        </w:rPr>
+      </w:r>
+    </w:p>
+    <w:p>
+      <w:pPr>
+        <w:spacing w:after="0"/>
+        <w:ind/>
+      </w:pPr>
+      <w:r>
+        <w:rPr>
+          <w:b/>
+          <w:sz w:val="24"/>
+        </w:rPr>
+        <w:t>CLINICAL ACTIVITIES &amp; PROGRAM DEVELOPMENT</w:t>
+      </w:r>
+    </w:p>
+    <w:p>
+      <w:pPr>
+        <w:spacing w:after="0"/>
+        <w:ind w:left="1440"/>
+      </w:pPr>
+      <w:r>
+        <w:rPr>
           <w:b w:val="0"/>
           <w:sz w:val="24"/>
         </w:rPr>
-        <w:t>Ultrasound Basics</w:t>
+        <w:t>2026-present</w:t>
+        <w:tab/>
+        <w:t>Director of Ultrasound, Department of Obstetrics &amp; Gynecology, University of Chicago. Assumed day-to-day operational leadership of the ultrasound unit in January 2026 following the departure of the prior director; formally appointed Director of Ultrasound in February 2026. Unit volume increased 7.3% over the first six months of leadership compared with the preceding six months (22,993 to 24,680 examinations); second-quarter 2026 volume reached 13,109 examinations, a 14.0% increase over the average of the two pre-transition quarters.</w:t>
+      </w:r>
+    </w:p>
+    <w:p>
+      <w:pPr>
+        <w:spacing w:after="0"/>
+        <w:ind w:left="1440"/>
+      </w:pPr>
+      <w:r>
+        <w:rPr>
+          <w:b w:val="0"/>
+          <w:sz w:val="24"/>
+        </w:rPr>
+        <w:t>Program development</w:t>
       </w:r>
     </w:p>
     <w:p>
@@ -1065,7 +1487,7 @@
           <w:b w:val="0"/>
           <w:sz w:val="24"/>
         </w:rPr>
-        <w:t>Fetal CNS Ultrasound</w:t>
+        <w:t>First-trimester detailed anatomy program, including AIUM practice accreditation</w:t>
       </w:r>
     </w:p>
     <w:p>
@@ -1078,7 +1500,7 @@
           <w:b w:val="0"/>
           <w:sz w:val="24"/>
         </w:rPr>
-        <w:t>Pulse Wave Doppler in Fetal Ultrasound</w:t>
+        <w:t>Targeted transabdominal and transvaginal fetal neurosonography</w:t>
       </w:r>
     </w:p>
     <w:p>
@@ -1091,20 +1513,7 @@
           <w:b w:val="0"/>
           <w:sz w:val="24"/>
         </w:rPr>
-        <w:t>First Trimester Detailed Anatomy</w:t>
-      </w:r>
-    </w:p>
-    <w:p>
-      <w:pPr>
-        <w:spacing w:after="0"/>
-        <w:ind w:left="2880"/>
-      </w:pPr>
-      <w:r>
-        <w:rPr>
-          <w:b w:val="0"/>
-          <w:sz w:val="24"/>
-        </w:rPr>
-        <w:t>Fundamentals of Needle Guided Intervention (FUNGI) simulation</w:t>
+        <w:t>Expansion of obstetric ultrasound services at Ingalls Memorial Hospital, including transition of obstetric imaging from Radiology</w:t>
       </w:r>
     </w:p>
     <w:p>
@@ -1112,791 +1521,340 @@
         <w:spacing w:after="0"/>
         <w:ind w:left="1440"/>
       </w:pPr>
-      <w:r>
-        <w:rPr>
-          <w:b w:val="0"/>
-          <w:sz w:val="24"/>
-        </w:rPr>
-        <w:t>Neonatology Fellowship, University of Chicago — didactics</w:t>
+    </w:p>
+    <w:p>
+      <w:pPr>
+        <w:spacing w:after="0" w:line="240" w:lineRule="auto"/>
+        <w:rPr>
+          <w:b w:val="1"/>
+          <w:bCs w:val="1"/>
+          <w:sz w:val="24"/>
+          <w:szCs w:val="24"/>
+        </w:rPr>
+      </w:pPr>
+      <w:r>
+        <w:rPr>
+          <w:b w:val="1"/>
+          <w:bCs w:val="1"/>
+          <w:sz w:val="24"/>
+          <w:szCs w:val="24"/>
+          <w:rtl w:val="0"/>
+        </w:rPr>
+        <w:t xml:space="preserve">PROFESSIONAL MEMBERSHIPS &amp; ASSOCIATIONS</w:t>
+      </w:r>
+    </w:p>
+    <w:p>
+      <w:pPr>
+        <w:spacing w:after="0" w:line="240" w:lineRule="auto"/>
+        <w:rPr>
+          <w:sz w:val="24"/>
+          <w:szCs w:val="24"/>
+        </w:rPr>
+      </w:pPr>
+      <w:r>
+        <w:rPr>
+          <w:sz w:val="24"/>
+          <w:szCs w:val="24"/>
+          <w:rtl w:val="0"/>
+        </w:rPr>
+        <w:t xml:space="preserve">Current</w:t>
+      </w:r>
+      <w:r>
+        <w:rPr>
+          <w:rtl w:val="0"/>
+        </w:rPr>
+        <w:tab/>
+      </w:r>
+      <w:r>
+        <w:rPr>
+          <w:sz w:val="24"/>
+          <w:szCs w:val="24"/>
+          <w:rtl w:val="0"/>
+        </w:rPr>
+        <w:t xml:space="preserve">American College of Obstetricians and Gynecologists – Fellow</w:t>
+      </w:r>
+    </w:p>
+    <w:p>
+      <w:pPr>
+        <w:spacing w:after="0" w:line="240" w:lineRule="auto"/>
+        <w:rPr>
+          <w:sz w:val="24"/>
+          <w:szCs w:val="24"/>
+        </w:rPr>
+      </w:pPr>
+      <w:r>
+        <w:rPr>
+          <w:sz w:val="24"/>
+          <w:szCs w:val="24"/>
+          <w:rtl w:val="0"/>
+        </w:rPr>
+        <w:t xml:space="preserve">Current</w:t>
+      </w:r>
+      <w:r>
+        <w:rPr>
+          <w:rtl w:val="0"/>
+        </w:rPr>
+        <w:tab/>
+      </w:r>
+      <w:r>
+        <w:rPr>
+          <w:sz w:val="24"/>
+          <w:szCs w:val="24"/>
+          <w:rtl w:val="0"/>
+        </w:rPr>
+        <w:t xml:space="preserve">Society for Maternal-Fetal Medicine - Member</w:t>
+      </w:r>
+    </w:p>
+    <w:p>
+      <w:pPr>
+        <w:spacing w:after="0" w:line="240" w:lineRule="auto"/>
+        <w:rPr>
+          <w:sz w:val="24"/>
+          <w:szCs w:val="24"/>
+        </w:rPr>
+      </w:pPr>
+      <w:r>
+        <w:rPr>
+          <w:sz w:val="24"/>
+          <w:szCs w:val="24"/>
+          <w:rtl w:val="0"/>
+        </w:rPr>
+        <w:t xml:space="preserve">Current</w:t>
+        <w:tab/>
+        <w:t xml:space="preserve">American Institute of Ultrasound in Medicine – Member</w:t>
+      </w:r>
+    </w:p>
+    <w:p>
+      <w:pPr>
+        <w:spacing w:after="0" w:line="240" w:lineRule="auto"/>
+        <w:rPr>
+          <w:sz w:val="24"/>
+          <w:szCs w:val="24"/>
+        </w:rPr>
+      </w:pPr>
+      <w:r>
+        <w:rPr>
+          <w:sz w:val="24"/>
+          <w:szCs w:val="24"/>
+          <w:rtl w:val="0"/>
+        </w:rPr>
+        <w:t xml:space="preserve">Current</w:t>
+      </w:r>
+      <w:r>
+        <w:rPr>
+          <w:rtl w:val="0"/>
+        </w:rPr>
+        <w:tab/>
+      </w:r>
+      <w:r>
+        <w:rPr>
+          <w:sz w:val="24"/>
+          <w:szCs w:val="24"/>
+          <w:rtl w:val="0"/>
+        </w:rPr>
+        <w:t xml:space="preserve">International Society of Ultrasound in Obstetrics and Gynecology - Member</w:t>
+      </w:r>
+    </w:p>
+    <w:p>
+      <w:pPr>
+        <w:spacing w:after="0" w:line="240" w:lineRule="auto"/>
+        <w:rPr>
+          <w:sz w:val="24"/>
+          <w:szCs w:val="24"/>
+        </w:rPr>
+      </w:pPr>
+      <w:r>
+        <w:rPr>
+          <w:sz w:val="24"/>
+          <w:szCs w:val="24"/>
+          <w:rtl w:val="0"/>
+        </w:rPr>
+        <w:t xml:space="preserve">Current</w:t>
+      </w:r>
+      <w:r>
+        <w:rPr>
+          <w:rtl w:val="0"/>
+        </w:rPr>
+        <w:tab/>
+      </w:r>
+      <w:r>
+        <w:rPr>
+          <w:sz w:val="24"/>
+          <w:szCs w:val="24"/>
+          <w:rtl w:val="0"/>
+        </w:rPr>
+        <w:t xml:space="preserve">Massachusetts Medical Society – Member</w:t>
+      </w:r>
+    </w:p>
+    <w:p>
+      <w:pPr>
+        <w:spacing w:after="0" w:line="240" w:lineRule="auto"/>
+        <w:rPr>
+          <w:sz w:val="24"/>
+          <w:szCs w:val="24"/>
+        </w:rPr>
+      </w:pPr>
+      <w:r>
+        <w:rPr>
+          <w:sz w:val="24"/>
+          <w:szCs w:val="24"/>
+          <w:rtl w:val="0"/>
+        </w:rPr>
+        <w:t xml:space="preserve">Current</w:t>
+        <w:tab/>
+        <w:t xml:space="preserve">Society for Pediatric Radiology – Allied Member</w:t>
+      </w:r>
+    </w:p>
+    <w:p>
+      <w:pPr>
+        <w:spacing w:after="0" w:line="240" w:lineRule="auto"/>
+        <w:rPr>
+          <w:sz w:val="24"/>
+          <w:szCs w:val="24"/>
+        </w:rPr>
+      </w:pPr>
+      <w:r>
+        <w:rPr>
+          <w:sz w:val="24"/>
+          <w:szCs w:val="24"/>
+          <w:rtl w:val="0"/>
+        </w:rPr>
+        <w:t xml:space="preserve">Current</w:t>
+        <w:tab/>
+        <w:t xml:space="preserve">International Society for Prenatal Diagnosis – Member</w:t>
+      </w:r>
+    </w:p>
+    <w:p>
+      <w:pPr>
+        <w:spacing w:after="0" w:line="240" w:lineRule="auto"/>
+        <w:rPr>
+          <w:sz w:val="24"/>
+          <w:szCs w:val="24"/>
+        </w:rPr>
+      </w:pPr>
+      <w:r>
+        <w:rPr>
+          <w:sz w:val="24"/>
+          <w:szCs w:val="24"/>
+          <w:rtl w:val="0"/>
+        </w:rPr>
+        <w:t xml:space="preserve">Current</w:t>
+        <w:tab/>
+        <w:t xml:space="preserve">Ad hoc</w:t>
+      </w:r>
+      <w:r>
+        <w:rPr>
+          <w:rtl w:val="0"/>
+        </w:rPr>
+        <w:t xml:space="preserve"> </w:t>
+      </w:r>
+      <w:r>
+        <w:rPr>
+          <w:sz w:val="24"/>
+          <w:szCs w:val="24"/>
+          <w:rtl w:val="0"/>
+        </w:rPr>
+        <w:t xml:space="preserve">Reviewer for Ultrasound in Obstetrics and Gynecology</w:t>
+      </w:r>
+    </w:p>
+    <w:p>
+      <w:pPr>
+        <w:spacing w:after="0" w:line="240" w:lineRule="auto"/>
+        <w:ind w:left="1440"/>
+        <w:rPr>
+          <w:sz w:val="24"/>
+          <w:szCs w:val="24"/>
+        </w:rPr>
+      </w:pPr>
+      <w:r>
+        <w:rPr>
+          <w:sz w:val="24"/>
+          <w:szCs w:val="24"/>
+          <w:rtl w:val="0"/>
+        </w:rPr>
+        <w:t xml:space="preserve">2023</w:t>
+        <w:tab/>
+        <w:t xml:space="preserve">Invited Reviewer for Institute for Translational Medicine Grant, University of Chicago</w:t>
+      </w:r>
+    </w:p>
+    <w:p>
+      <w:pPr>
+        <w:spacing w:after="0" w:line="240" w:lineRule="auto"/>
+        <w:rPr>
+          <w:sz w:val="24"/>
+          <w:szCs w:val="24"/>
+        </w:rPr>
+      </w:pPr>
+      <w:r>
+        <w:rPr>
+          <w:rtl w:val="0"/>
+        </w:rPr>
+      </w:r>
+    </w:p>
+    <w:p>
+      <w:pPr>
+        <w:spacing w:after="0" w:line="240" w:lineRule="auto"/>
+        <w:rPr>
+          <w:b w:val="1"/>
+          <w:bCs w:val="1"/>
+          <w:sz w:val="24"/>
+          <w:szCs w:val="24"/>
+        </w:rPr>
+      </w:pPr>
+      <w:r>
+        <w:rPr>
+          <w:b w:val="1"/>
+          <w:bCs w:val="1"/>
+          <w:sz w:val="24"/>
+          <w:szCs w:val="24"/>
+          <w:rtl w:val="0"/>
+        </w:rPr>
+        <w:t xml:space="preserve">MENTEES</w:t>
+      </w:r>
+    </w:p>
+    <w:p>
+      <w:pPr>
+        <w:spacing w:after="0" w:line="240" w:lineRule="auto"/>
+        <w:rPr>
+          <w:sz w:val="24"/>
+          <w:szCs w:val="24"/>
+        </w:rPr>
+      </w:pPr>
+      <w:r>
+        <w:rPr>
+          <w:sz w:val="24"/>
+          <w:szCs w:val="24"/>
+          <w:rtl w:val="0"/>
+        </w:rPr>
+        <w:t xml:space="preserve">Alexandra Diaz-Barbe - Pritzker School of Medicine medical student - A low-cost, low-fidelity model of fetal intracardiac intervention</w:t>
+      </w:r>
+    </w:p>
+    <w:p>
+      <w:pPr>
+        <w:spacing w:after="0" w:line="240" w:lineRule="auto"/>
+        <w:rPr>
+          <w:sz w:val="24"/>
+          <w:szCs w:val="24"/>
+        </w:rPr>
+      </w:pPr>
+      <w:r>
+        <w:rPr>
+          <w:sz w:val="24"/>
+          <w:szCs w:val="24"/>
+          <w:rtl w:val="0"/>
+        </w:rPr>
+        <w:t xml:space="preserve">Christy Evans - University of Chicago/Endeavor Ob/Gyn resident - A cerclage simulation model</w:t>
       </w:r>
     </w:p>
     <w:p>
       <w:pPr>
         <w:spacing w:after="0"/>
-        <w:ind w:left="2880"/>
-      </w:pPr>
-      <w:r>
-        <w:rPr>
-          <w:b w:val="0"/>
-          <w:sz w:val="24"/>
-        </w:rPr>
-        <w:t>Maternal-Fetal Medicine Topics in NICU Care</w:t>
-      </w:r>
-    </w:p>
-    <w:p>
-      <w:pPr>
-        <w:spacing w:after="0"/>
-        <w:ind w:left="1440"/>
-      </w:pPr>
-    </w:p>
-    <w:p>
-      <w:pPr>
-        <w:spacing w:after="0" w:line="240" w:lineRule="auto"/>
-        <w:ind/>
-        <w:rPr>
-          <w:sz w:val="24"/>
-          <w:szCs w:val="24"/>
-        </w:rPr>
-      </w:pPr>
-      <w:r>
-        <w:rPr>
-          <w:b w:val="1"/>
-          <w:bCs w:val="1"/>
-          <w:sz w:val="24"/>
-          <w:szCs w:val="24"/>
-          <w:rtl w:val="0"/>
-        </w:rPr>
-        <w:t xml:space="preserve">INSTITUTIONAL &amp; PROGRAM POSITIONS</w:t>
-      </w:r>
-      <w:r>
-        <w:rPr>
-          <w:rtl w:val="0"/>
-        </w:rPr>
-      </w:r>
-    </w:p>
-    <w:p>
-      <w:pPr>
-        <w:spacing w:after="0" w:line="240" w:lineRule="auto"/>
-        <w:ind w:left="1440" w:firstLine="0"/>
-        <w:rPr>
-          <w:sz w:val="24"/>
-          <w:szCs w:val="24"/>
-        </w:rPr>
-      </w:pPr>
-      <w:r>
-        <w:rPr>
-          <w:sz w:val="24"/>
-          <w:szCs w:val="24"/>
-          <w:rtl w:val="0"/>
-        </w:rPr>
-        <w:t xml:space="preserve">2026-present</w:t>
-        <w:tab/>
-        <w:t xml:space="preserve">Director of Ultrasound, Department of Obstetrics &amp; Gynecology, University of Chicago</w:t>
-      </w:r>
-    </w:p>
-    <w:p>
-      <w:pPr>
-        <w:spacing w:after="0" w:line="240" w:lineRule="auto"/>
-        <w:ind w:left="1440" w:firstLine="0"/>
-        <w:rPr>
-          <w:sz w:val="24"/>
-          <w:szCs w:val="24"/>
-        </w:rPr>
-      </w:pPr>
-      <w:r>
-        <w:rPr>
-          <w:sz w:val="24"/>
-          <w:szCs w:val="24"/>
-          <w:rtl w:val="0"/>
-        </w:rPr>
-        <w:t xml:space="preserve">2025-present</w:t>
-        <w:tab/>
-        <w:t xml:space="preserve">MFM Lead, Pregnancy and Preconception in IBD clinic, University of Chicago</w:t>
-      </w:r>
-    </w:p>
-    <w:p>
-      <w:pPr>
-        <w:spacing w:after="0"/>
-        <w:ind w:left="1440"/>
-      </w:pPr>
-      <w:r>
-        <w:rPr>
-          <w:i/>
-          <w:sz w:val="24"/>
-        </w:rPr>
-        <w:t>[TBC] Upcoming: MFM Lead, Cancer in Pregnancy Center, University of Chicago (not yet started).</w:t>
-      </w:r>
-    </w:p>
-    <w:p>
-      <w:pPr>
-        <w:spacing w:after="0" w:line="240" w:lineRule="auto"/>
-        <w:ind w:left="1440"/>
-        <w:rPr>
-          <w:sz w:val="24"/>
-          <w:szCs w:val="24"/>
-        </w:rPr>
-      </w:pPr>
-      <w:r>
-        <w:rPr>
-          <w:sz w:val="24"/>
-          <w:szCs w:val="24"/>
-          <w:rtl w:val="0"/>
-        </w:rPr>
-        <w:t xml:space="preserve">2024-present</w:t>
-        <w:tab/>
-        <w:t xml:space="preserve">FBC Policy Committee, University of Chicago</w:t>
-      </w:r>
-    </w:p>
-    <w:p>
-      <w:pPr>
-        <w:spacing w:after="0" w:line="240" w:lineRule="auto"/>
-        <w:ind w:left="1440"/>
-        <w:rPr>
-          <w:sz w:val="24"/>
-          <w:szCs w:val="24"/>
-        </w:rPr>
-      </w:pPr>
-      <w:r>
-        <w:rPr>
-          <w:sz w:val="24"/>
-          <w:szCs w:val="24"/>
-          <w:rtl w:val="0"/>
-        </w:rPr>
-        <w:t xml:space="preserve">2022-present</w:t>
-        <w:tab/>
-        <w:t xml:space="preserve">Sub-internship lead, Antepartum and Birth Rooms Sub-I University of Chicago</w:t>
-      </w:r>
-    </w:p>
-    <w:p>
-      <w:pPr>
-        <w:spacing w:after="0" w:line="240" w:lineRule="auto"/>
-        <w:ind w:left="1440"/>
-        <w:rPr>
-          <w:sz w:val="24"/>
-          <w:szCs w:val="24"/>
-        </w:rPr>
-      </w:pPr>
-      <w:r>
-        <w:rPr>
-          <w:sz w:val="24"/>
-          <w:szCs w:val="24"/>
-          <w:rtl w:val="0"/>
-        </w:rPr>
-        <w:t>2026-present</w:t>
-      </w:r>
-      <w:r>
-        <w:rPr>
-          <w:rtl w:val="0"/>
-        </w:rPr>
-        <w:tab/>
-      </w:r>
-      <w:r>
-        <w:rPr>
-          <w:sz w:val="24"/>
-          <w:szCs w:val="24"/>
-          <w:rtl w:val="0"/>
-        </w:rPr>
-        <w:t>Associate Program Director, MFM Fellowship, University of Chicago</w:t>
-      </w:r>
-    </w:p>
-    <w:p>
-      <w:pPr>
-        <w:spacing w:after="0"/>
-        <w:ind w:left="1440"/>
-      </w:pPr>
-      <w:r>
-        <w:rPr>
-          <w:sz w:val="24"/>
-        </w:rPr>
-        <w:t>2022-2026</w:t>
-        <w:tab/>
-        <w:t>Site Director, MFM Fellowship, University of Chicago</w:t>
-      </w:r>
-    </w:p>
-    <w:p>
-      <w:pPr>
-        <w:spacing w:after="0" w:line="240" w:lineRule="auto"/>
-        <w:ind w:left="1440"/>
-        <w:rPr>
-          <w:sz w:val="24"/>
-          <w:szCs w:val="24"/>
-        </w:rPr>
-      </w:pPr>
-      <w:r>
-        <w:rPr>
-          <w:sz w:val="24"/>
-          <w:szCs w:val="24"/>
-          <w:rtl w:val="0"/>
-        </w:rPr>
-        <w:t xml:space="preserve">2022-present</w:t>
-      </w:r>
-      <w:r>
-        <w:rPr>
-          <w:rtl w:val="0"/>
-        </w:rPr>
-        <w:tab/>
-      </w:r>
-      <w:r>
-        <w:rPr>
-          <w:sz w:val="24"/>
-          <w:szCs w:val="24"/>
-          <w:rtl w:val="0"/>
-        </w:rPr>
-        <w:t xml:space="preserve">Med Ed Champion (MFM), OB/Gyn residency, University of Chicago</w:t>
-      </w:r>
-    </w:p>
-    <w:p>
-      <w:pPr>
-        <w:spacing w:after="0" w:line="240" w:lineRule="auto"/>
-        <w:ind w:left="1440"/>
-        <w:rPr>
-          <w:sz w:val="24"/>
-          <w:szCs w:val="24"/>
-        </w:rPr>
-      </w:pPr>
-      <w:r>
-        <w:rPr>
-          <w:sz w:val="24"/>
-          <w:szCs w:val="24"/>
-          <w:rtl w:val="0"/>
-        </w:rPr>
-        <w:t xml:space="preserve">2021-present</w:t>
-        <w:tab/>
-        <w:t xml:space="preserve">Resident Recruitment Committee, University of Chicago</w:t>
-      </w:r>
-    </w:p>
-    <w:p>
-      <w:pPr>
-        <w:spacing w:after="0" w:line="240" w:lineRule="auto"/>
-        <w:ind w:left="1440"/>
-        <w:rPr>
-          <w:sz w:val="24"/>
-          <w:szCs w:val="24"/>
-        </w:rPr>
-      </w:pPr>
-      <w:r>
-        <w:rPr>
-          <w:sz w:val="24"/>
-          <w:szCs w:val="24"/>
-          <w:rtl w:val="0"/>
-        </w:rPr>
-        <w:t xml:space="preserve">2021-present</w:t>
-        <w:tab/>
-        <w:t xml:space="preserve">MFM Fellow Recruitment Committee, University of Chicago</w:t>
-      </w:r>
-    </w:p>
-    <w:p>
-      <w:pPr>
-        <w:spacing w:after="0" w:line="240" w:lineRule="auto"/>
-        <w:ind w:left="1440"/>
-        <w:rPr>
-          <w:sz w:val="24"/>
-          <w:szCs w:val="24"/>
-        </w:rPr>
-      </w:pPr>
-      <w:r>
-        <w:rPr>
-          <w:sz w:val="24"/>
-          <w:szCs w:val="24"/>
-          <w:rtl w:val="0"/>
-        </w:rPr>
-        <w:t xml:space="preserve">2021-present</w:t>
-        <w:tab/>
-        <w:t xml:space="preserve">Clinical Competency Committee, Ob/Gyn residency, University of Chicago</w:t>
-      </w:r>
-    </w:p>
-    <w:p>
-      <w:pPr>
-        <w:spacing w:after="0" w:line="240" w:lineRule="auto"/>
-        <w:ind w:left="1440"/>
-        <w:rPr>
-          <w:sz w:val="24"/>
-          <w:szCs w:val="24"/>
-        </w:rPr>
-      </w:pPr>
-      <w:r>
-        <w:rPr>
-          <w:sz w:val="24"/>
-          <w:szCs w:val="24"/>
-          <w:rtl w:val="0"/>
-        </w:rPr>
-        <w:t xml:space="preserve">2021-present</w:t>
-        <w:tab/>
-        <w:t xml:space="preserve">Clinical Competency Committee, MFM Fellowship, University of Chicago</w:t>
-      </w:r>
-    </w:p>
-    <w:p>
-      <w:pPr>
-        <w:spacing w:after="0" w:line="240" w:lineRule="auto"/>
-        <w:ind w:left="1440"/>
-        <w:rPr>
-          <w:sz w:val="24"/>
-          <w:szCs w:val="24"/>
-        </w:rPr>
-      </w:pPr>
-      <w:r>
-        <w:rPr>
-          <w:sz w:val="24"/>
-          <w:szCs w:val="24"/>
-          <w:rtl w:val="0"/>
-        </w:rPr>
-        <w:t xml:space="preserve">2021-present</w:t>
-        <w:tab/>
-        <w:t xml:space="preserve">Program Evaluation Committee, Ob/Gyn residency, University of Chicago</w:t>
-      </w:r>
-    </w:p>
-    <w:p>
-      <w:pPr>
-        <w:spacing w:after="0" w:line="240" w:lineRule="auto"/>
-        <w:ind w:left="1440"/>
-        <w:rPr>
-          <w:sz w:val="24"/>
-          <w:szCs w:val="24"/>
-        </w:rPr>
-      </w:pPr>
-      <w:r>
-        <w:rPr>
-          <w:sz w:val="24"/>
-          <w:szCs w:val="24"/>
-          <w:rtl w:val="0"/>
-        </w:rPr>
-        <w:t>2021-present</w:t>
-        <w:tab/>
-        <w:t>Program Evaluation Committee, MFM Fellowship, University of Chicago</w:t>
-      </w:r>
-    </w:p>
-    <w:p>
-      <w:pPr>
-        <w:spacing w:after="0" w:line="240" w:lineRule="auto"/>
-        <w:ind w:left="1440"/>
-        <w:rPr>
-          <w:sz w:val="24"/>
-          <w:szCs w:val="24"/>
-        </w:rPr>
-      </w:pPr>
-      <w:r>
-        <w:rPr>
-          <w:sz w:val="24"/>
-          <w:szCs w:val="24"/>
-          <w:rtl w:val="0"/>
-        </w:rPr>
-        <w:t xml:space="preserve">2019-2021</w:t>
-        <w:tab/>
-        <w:t xml:space="preserve">Program Evaluation Committee, Fellow Representative, MFM Fellowship, Northwell Health/Hofstra University</w:t>
-      </w:r>
-    </w:p>
-    <w:p>
-      <w:pPr>
-        <w:spacing w:after="0" w:line="240" w:lineRule="auto"/>
-        <w:rPr>
-          <w:sz w:val="24"/>
-          <w:szCs w:val="24"/>
-        </w:rPr>
-      </w:pPr>
-      <w:r>
-        <w:rPr>
-          <w:rtl w:val="0"/>
-        </w:rPr>
-      </w:r>
-    </w:p>
-    <w:p>
-      <w:pPr>
-        <w:spacing w:after="0"/>
-        <w:ind/>
-      </w:pPr>
-      <w:r>
-        <w:rPr>
-          <w:b/>
-          <w:sz w:val="24"/>
-        </w:rPr>
-        <w:t>CLINICAL ACTIVITIES &amp; PROGRAM DEVELOPMENT</w:t>
-      </w:r>
-    </w:p>
-    <w:p>
-      <w:pPr>
-        <w:spacing w:after="0"/>
-        <w:ind w:left="1440"/>
-      </w:pPr>
-      <w:r>
-        <w:rPr>
-          <w:b w:val="0"/>
-          <w:sz w:val="24"/>
-        </w:rPr>
-        <w:t>2026-present</w:t>
-        <w:tab/>
-        <w:t>Director of Ultrasound, Department of Obstetrics &amp; Gynecology, University of Chicago. Assumed day-to-day operational leadership of the ultrasound unit in January 2026 following the departure of the prior director; formally appointed Director of Ultrasound in February 2026. Unit volume increased 7.3% over the first six months of leadership compared with the preceding six months (22,993 to 24,680 examinations); second-quarter 2026 volume reached 13,109 examinations, a 14.0% increase over the average of the two pre-transition quarters.</w:t>
-      </w:r>
-    </w:p>
-    <w:p>
-      <w:pPr>
-        <w:spacing w:after="0"/>
-        <w:ind w:left="1440"/>
-      </w:pPr>
-      <w:r>
-        <w:rPr>
-          <w:b w:val="0"/>
-          <w:sz w:val="24"/>
-        </w:rPr>
-        <w:t>Program development</w:t>
-      </w:r>
-    </w:p>
-    <w:p>
-      <w:pPr>
-        <w:spacing w:after="0"/>
-        <w:ind w:left="2880"/>
-      </w:pPr>
-      <w:r>
-        <w:rPr>
-          <w:b w:val="0"/>
-          <w:sz w:val="24"/>
-        </w:rPr>
-        <w:t>First-trimester detailed anatomy program, including AIUM practice accreditation</w:t>
-      </w:r>
-    </w:p>
-    <w:p>
-      <w:pPr>
-        <w:spacing w:after="0"/>
-        <w:ind w:left="2880"/>
-      </w:pPr>
-      <w:r>
-        <w:rPr>
-          <w:b w:val="0"/>
-          <w:sz w:val="24"/>
-        </w:rPr>
-        <w:t>Targeted transabdominal and transvaginal fetal neurosonography</w:t>
-      </w:r>
-    </w:p>
-    <w:p>
-      <w:pPr>
-        <w:spacing w:after="0"/>
-        <w:ind w:left="2880"/>
-      </w:pPr>
-      <w:r>
-        <w:rPr>
-          <w:b w:val="0"/>
-          <w:sz w:val="24"/>
-        </w:rPr>
-        <w:t>Expansion of obstetric ultrasound services at Ingalls Memorial Hospital, including transition of obstetric imaging from Radiology</w:t>
-      </w:r>
-    </w:p>
-    <w:p>
-      <w:pPr>
-        <w:spacing w:after="0"/>
-        <w:ind w:left="1440"/>
-      </w:pPr>
-    </w:p>
-    <w:p>
-      <w:pPr>
-        <w:spacing w:after="0" w:line="240" w:lineRule="auto"/>
-        <w:rPr>
-          <w:b w:val="1"/>
-          <w:bCs w:val="1"/>
-          <w:sz w:val="24"/>
-          <w:szCs w:val="24"/>
-        </w:rPr>
-      </w:pPr>
-      <w:r>
-        <w:rPr>
-          <w:b w:val="1"/>
-          <w:bCs w:val="1"/>
-          <w:sz w:val="24"/>
-          <w:szCs w:val="24"/>
-          <w:rtl w:val="0"/>
-        </w:rPr>
-        <w:t xml:space="preserve">PROFESSIONAL MEMBERSHIPS &amp; ASSOCIATIONS</w:t>
-      </w:r>
-    </w:p>
-    <w:p>
-      <w:pPr>
-        <w:spacing w:after="0" w:line="240" w:lineRule="auto"/>
-        <w:rPr>
-          <w:sz w:val="24"/>
-          <w:szCs w:val="24"/>
-        </w:rPr>
-      </w:pPr>
-      <w:r>
-        <w:rPr>
-          <w:sz w:val="24"/>
-          <w:szCs w:val="24"/>
-          <w:rtl w:val="0"/>
-        </w:rPr>
-        <w:t xml:space="preserve">Current</w:t>
-      </w:r>
-      <w:r>
-        <w:rPr>
-          <w:rtl w:val="0"/>
-        </w:rPr>
-        <w:tab/>
-      </w:r>
-      <w:r>
-        <w:rPr>
-          <w:sz w:val="24"/>
-          <w:szCs w:val="24"/>
-          <w:rtl w:val="0"/>
-        </w:rPr>
-        <w:t xml:space="preserve">American College of Obstetricians and Gynecologists – Fellow</w:t>
-      </w:r>
-    </w:p>
-    <w:p>
-      <w:pPr>
-        <w:spacing w:after="0" w:line="240" w:lineRule="auto"/>
-        <w:rPr>
-          <w:sz w:val="24"/>
-          <w:szCs w:val="24"/>
-        </w:rPr>
-      </w:pPr>
-      <w:r>
-        <w:rPr>
-          <w:sz w:val="24"/>
-          <w:szCs w:val="24"/>
-          <w:rtl w:val="0"/>
-        </w:rPr>
-        <w:t xml:space="preserve">Current</w:t>
-      </w:r>
-      <w:r>
-        <w:rPr>
-          <w:rtl w:val="0"/>
-        </w:rPr>
-        <w:tab/>
-      </w:r>
-      <w:r>
-        <w:rPr>
-          <w:sz w:val="24"/>
-          <w:szCs w:val="24"/>
-          <w:rtl w:val="0"/>
-        </w:rPr>
-        <w:t xml:space="preserve">Society for Maternal-Fetal Medicine - Member</w:t>
-      </w:r>
-    </w:p>
-    <w:p>
-      <w:pPr>
-        <w:spacing w:after="0" w:line="240" w:lineRule="auto"/>
-        <w:rPr>
-          <w:sz w:val="24"/>
-          <w:szCs w:val="24"/>
-        </w:rPr>
-      </w:pPr>
-      <w:r>
-        <w:rPr>
-          <w:sz w:val="24"/>
-          <w:szCs w:val="24"/>
-          <w:rtl w:val="0"/>
-        </w:rPr>
-        <w:t xml:space="preserve">Current</w:t>
-        <w:tab/>
-        <w:t xml:space="preserve">American Institute of Ultrasound in Medicine – Member</w:t>
-      </w:r>
-    </w:p>
-    <w:p>
-      <w:pPr>
-        <w:spacing w:after="0" w:line="240" w:lineRule="auto"/>
-        <w:rPr>
-          <w:sz w:val="24"/>
-          <w:szCs w:val="24"/>
-        </w:rPr>
-      </w:pPr>
-      <w:r>
-        <w:rPr>
-          <w:sz w:val="24"/>
-          <w:szCs w:val="24"/>
-          <w:rtl w:val="0"/>
-        </w:rPr>
-        <w:t xml:space="preserve">Current</w:t>
-      </w:r>
-      <w:r>
-        <w:rPr>
-          <w:rtl w:val="0"/>
-        </w:rPr>
-        <w:tab/>
-      </w:r>
-      <w:r>
-        <w:rPr>
-          <w:sz w:val="24"/>
-          <w:szCs w:val="24"/>
-          <w:rtl w:val="0"/>
-        </w:rPr>
-        <w:t xml:space="preserve">International Society of Ultrasound in Obstetrics and Gynecology - Member</w:t>
-      </w:r>
-    </w:p>
-    <w:p>
-      <w:pPr>
-        <w:spacing w:after="0" w:line="240" w:lineRule="auto"/>
-        <w:rPr>
-          <w:sz w:val="24"/>
-          <w:szCs w:val="24"/>
-        </w:rPr>
-      </w:pPr>
-      <w:r>
-        <w:rPr>
-          <w:sz w:val="24"/>
-          <w:szCs w:val="24"/>
-          <w:rtl w:val="0"/>
-        </w:rPr>
-        <w:t xml:space="preserve">Current</w:t>
-      </w:r>
-      <w:r>
-        <w:rPr>
-          <w:rtl w:val="0"/>
-        </w:rPr>
-        <w:tab/>
-      </w:r>
-      <w:r>
-        <w:rPr>
-          <w:sz w:val="24"/>
-          <w:szCs w:val="24"/>
-          <w:rtl w:val="0"/>
-        </w:rPr>
-        <w:t xml:space="preserve">Massachusetts Medical Society – Member</w:t>
-      </w:r>
-    </w:p>
-    <w:p>
-      <w:pPr>
-        <w:spacing w:after="0" w:line="240" w:lineRule="auto"/>
-        <w:rPr>
-          <w:sz w:val="24"/>
-          <w:szCs w:val="24"/>
-        </w:rPr>
-      </w:pPr>
-      <w:r>
-        <w:rPr>
-          <w:sz w:val="24"/>
-          <w:szCs w:val="24"/>
-          <w:rtl w:val="0"/>
-        </w:rPr>
-        <w:t xml:space="preserve">Current</w:t>
-        <w:tab/>
-        <w:t xml:space="preserve">Society for Pediatric Radiology – Allied Member</w:t>
-      </w:r>
-    </w:p>
-    <w:p>
-      <w:pPr>
-        <w:spacing w:after="0" w:line="240" w:lineRule="auto"/>
-        <w:rPr>
-          <w:sz w:val="24"/>
-          <w:szCs w:val="24"/>
-        </w:rPr>
-      </w:pPr>
-      <w:r>
-        <w:rPr>
-          <w:sz w:val="24"/>
-          <w:szCs w:val="24"/>
-          <w:rtl w:val="0"/>
-        </w:rPr>
-        <w:t xml:space="preserve">Current</w:t>
-        <w:tab/>
-        <w:t xml:space="preserve">International Society for Prenatal Diagnosis – Member</w:t>
-      </w:r>
-    </w:p>
-    <w:p>
-      <w:pPr>
-        <w:spacing w:after="0" w:line="240" w:lineRule="auto"/>
-        <w:rPr>
-          <w:sz w:val="24"/>
-          <w:szCs w:val="24"/>
-        </w:rPr>
-      </w:pPr>
-      <w:r>
-        <w:rPr>
-          <w:sz w:val="24"/>
-          <w:szCs w:val="24"/>
-          <w:rtl w:val="0"/>
-        </w:rPr>
-        <w:t xml:space="preserve">Current</w:t>
-        <w:tab/>
-        <w:t xml:space="preserve">Ad hoc</w:t>
-      </w:r>
-      <w:r>
-        <w:rPr>
-          <w:rtl w:val="0"/>
-        </w:rPr>
-        <w:t xml:space="preserve"> </w:t>
-      </w:r>
-      <w:r>
-        <w:rPr>
-          <w:sz w:val="24"/>
-          <w:szCs w:val="24"/>
-          <w:rtl w:val="0"/>
-        </w:rPr>
-        <w:t xml:space="preserve">Reviewer for Ultrasound in Obstetrics and Gynecology</w:t>
-      </w:r>
-    </w:p>
-    <w:p>
-      <w:pPr>
-        <w:spacing w:after="0" w:line="240" w:lineRule="auto"/>
-        <w:ind w:left="1440"/>
-        <w:rPr>
-          <w:sz w:val="24"/>
-          <w:szCs w:val="24"/>
-        </w:rPr>
-      </w:pPr>
-      <w:r>
-        <w:rPr>
-          <w:sz w:val="24"/>
-          <w:szCs w:val="24"/>
-          <w:rtl w:val="0"/>
-        </w:rPr>
-        <w:t xml:space="preserve">2023</w:t>
-        <w:tab/>
-        <w:t xml:space="preserve">Invited Reviewer for Institute for Translational Medicine Grant, University of Chicago</w:t>
-      </w:r>
-    </w:p>
-    <w:p>
-      <w:pPr>
-        <w:spacing w:after="0" w:line="240" w:lineRule="auto"/>
-        <w:rPr>
-          <w:sz w:val="24"/>
-          <w:szCs w:val="24"/>
-        </w:rPr>
-      </w:pPr>
-      <w:r>
-        <w:rPr>
-          <w:rtl w:val="0"/>
-        </w:rPr>
-      </w:r>
-    </w:p>
-    <w:p>
-      <w:pPr>
-        <w:spacing w:after="0" w:line="240" w:lineRule="auto"/>
-        <w:rPr>
-          <w:b w:val="1"/>
-          <w:bCs w:val="1"/>
-          <w:sz w:val="24"/>
-          <w:szCs w:val="24"/>
-        </w:rPr>
-      </w:pPr>
-      <w:r>
-        <w:rPr>
-          <w:b w:val="1"/>
-          <w:bCs w:val="1"/>
-          <w:sz w:val="24"/>
-          <w:szCs w:val="24"/>
-          <w:rtl w:val="0"/>
-        </w:rPr>
-        <w:t xml:space="preserve">MENTEES</w:t>
-      </w:r>
-    </w:p>
-    <w:p>
-      <w:pPr>
-        <w:spacing w:after="0" w:line="240" w:lineRule="auto"/>
-        <w:rPr>
-          <w:sz w:val="24"/>
-          <w:szCs w:val="24"/>
-        </w:rPr>
-      </w:pPr>
-      <w:r>
-        <w:rPr>
-          <w:sz w:val="24"/>
-          <w:szCs w:val="24"/>
-          <w:rtl w:val="0"/>
-        </w:rPr>
-        <w:t xml:space="preserve">Alexandra Diaz-Barbe - Pritzker School of Medicine medical student - A low-cost, low-fidelity model of fetal intracardiac intervention</w:t>
-      </w:r>
-    </w:p>
-    <w:p>
-      <w:pPr>
-        <w:spacing w:after="0" w:line="240" w:lineRule="auto"/>
-        <w:rPr>
-          <w:sz w:val="24"/>
-          <w:szCs w:val="24"/>
-        </w:rPr>
-      </w:pPr>
-      <w:r>
-        <w:rPr>
-          <w:sz w:val="24"/>
-          <w:szCs w:val="24"/>
-          <w:rtl w:val="0"/>
-        </w:rPr>
-        <w:t xml:space="preserve">Christy Evans - University of Chicago/Endeavor Ob/Gyn resident - A cerclage simulation model</w:t>
+      </w:pPr>
+      <w:r>
+        <w:rPr>
+          <w:sz w:val="24"/>
+        </w:rPr>
+        <w:t>Leah Hefelfinger - University of Chicago Ob/Gyn resident (PGY-3) - Ultrasound curriculum survey for Ob/Gyn residency programs</w:t>
       </w:r>
     </w:p>
     <w:p>

</xml_diff>

<commit_message>
CV: add ABOG Simulation Summit cerclage abstract
Replaces the last remaining bibliography scaffold with the real entry:
Burns LP, Evans C, Rausch AC. Exam Indicated Cerclage Low Fidelity Training
Model. ABOG Simulation Summit. 2026.

Mirrored onto publications.html under Selected Abstracts per the CV/site
sync rule.

PDF re-exported: 6 pages, no [TBC] text, every line still starting at
x=72.1 or x=154.9, content diff limited to the new entry.

Co-Authored-By: Claude Opus 5 <noreply@anthropic.com>
Claude-Session: https://claude.ai/code/session_01WvtvM9z3qsF79i4F6oBD7k
</commit_message>
<xml_diff>
--- a/Andrew_Rausch_CV.docx
+++ b/Andrew_Rausch_CV.docx
@@ -2987,10 +2987,19 @@
       </w:pPr>
       <w:r>
         <w:rPr>
-          <w:i/>
-          <w:sz w:val="24"/>
-        </w:rPr>
-        <w:t>[TBC] ABOG Simulation Summit 2026 – Evans C, Rausch AC, Burns LP. Need exact submission title.</w:t>
+          <w:sz w:val="24"/>
+        </w:rPr>
+      </w:r>
+    </w:p>
+    <w:p>
+      <w:pPr>
+        <w:spacing w:after="0"/>
+      </w:pPr>
+      <w:r>
+        <w:rPr>
+          <w:sz w:val="24"/>
+        </w:rPr>
+        <w:t>Burns LP, Evans C, Rausch AC. Exam Indicated Cerclage Low Fidelity Training Model. ABOG Simulation Summit. 2026.</w:t>
       </w:r>
     </w:p>
     <w:p>

</xml_diff>